<commit_message>
Game mechanics toegevoegd: collision, game over, restart systeem en enemy spawning
</commit_message>
<xml_diff>
--- a/Docs/Logboek.docx
+++ b/Docs/Logboek.docx
@@ -43,27 +43,90 @@
         </w:rPr>
       </w:pPr>
       <w:r>
+        <w:rPr>
+          <w:lang w:val="nl-NL"/>
+        </w:rPr>
         <w:t>- Unity project aangemaakt</w:t>
       </w:r>
       <w:r>
+        <w:rPr>
+          <w:lang w:val="nl-NL"/>
+        </w:rPr>
         <w:br/>
         <w:t>- Project gekoppeld aan GitHub</w:t>
       </w:r>
       <w:r>
+        <w:rPr>
+          <w:lang w:val="nl-NL"/>
+        </w:rPr>
         <w:br/>
         <w:t>- Folder structuur gemaakt</w:t>
       </w:r>
       <w:r>
+        <w:rPr>
+          <w:lang w:val="nl-NL"/>
+        </w:rPr>
         <w:br/>
         <w:t>- Player object gemaakt</w:t>
       </w:r>
       <w:r>
+        <w:rPr>
+          <w:lang w:val="nl-NL"/>
+        </w:rPr>
         <w:br/>
         <w:t>- Movement script toegevoegd</w:t>
       </w:r>
       <w:r>
+        <w:rPr>
+          <w:lang w:val="nl-NL"/>
+        </w:rPr>
         <w:br/>
         <w:t>- Input system fout opgelost</w:t>
+      </w:r>
+    </w:p>
+    <w:p>
+      <w:pPr>
+        <w:rPr>
+          <w:lang w:val="nl-NL"/>
+        </w:rPr>
+      </w:pPr>
+    </w:p>
+    <w:p>
+      <w:pPr>
+        <w:rPr>
+          <w:lang w:val="nl-NL"/>
+        </w:rPr>
+      </w:pPr>
+    </w:p>
+    <w:p>
+      <w:pPr>
+        <w:rPr>
+          <w:lang w:val="nl-NL"/>
+        </w:rPr>
+      </w:pPr>
+      <w:r>
+        <w:rPr>
+          <w:lang w:val="nl-NL"/>
+        </w:rPr>
+        <w:t># Dag 2</w:t>
+      </w:r>
+    </w:p>
+    <w:p>
+      <w:pPr>
+        <w:pStyle w:val="Lijstalinea"/>
+        <w:numPr>
+          <w:ilvl w:val="0"/>
+          <w:numId w:val="1"/>
+        </w:numPr>
+        <w:rPr>
+          <w:lang w:val="nl-NL"/>
+        </w:rPr>
+      </w:pPr>
+      <w:r>
+        <w:rPr>
+          <w:lang w:val="nl-NL"/>
+        </w:rPr>
+        <w:t>Enemy movement aangemaakt</w:t>
       </w:r>
     </w:p>
     <w:sectPr>
@@ -74,6 +137,126 @@
     </w:sectPr>
   </w:body>
 </w:document>
+</file>
+
+<file path=word/numbering.xml><?xml version="1.0" encoding="utf-8"?>
+<w:numbering xmlns:wpc="http://schemas.microsoft.com/office/word/2010/wordprocessingCanvas" xmlns:cx="http://schemas.microsoft.com/office/drawing/2014/chartex" xmlns:cx1="http://schemas.microsoft.com/office/drawing/2015/9/8/chartex" xmlns:cx2="http://schemas.microsoft.com/office/drawing/2015/10/21/chartex" xmlns:cx3="http://schemas.microsoft.com/office/drawing/2016/5/9/chartex" xmlns:cx4="http://schemas.microsoft.com/office/drawing/2016/5/10/chartex" xmlns:cx5="http://schemas.microsoft.com/office/drawing/2016/5/11/chartex" xmlns:cx6="http://schemas.microsoft.com/office/drawing/2016/5/12/chartex" xmlns:cx7="http://schemas.microsoft.com/office/drawing/2016/5/13/chartex" xmlns:cx8="http://schemas.microsoft.com/office/drawing/2016/5/14/chartex" xmlns:mc="http://schemas.openxmlformats.org/markup-compatibility/2006" xmlns:aink="http://schemas.microsoft.com/office/drawing/2016/ink" xmlns:am3d="http://schemas.microsoft.com/office/drawing/2017/model3d" xmlns:o="urn:schemas-microsoft-com:office:office" xmlns:oel="http://schemas.microsoft.com/office/2019/extlst" xmlns:r="http://schemas.openxmlformats.org/officeDocument/2006/relationships" xmlns:m="http://schemas.openxmlformats.org/officeDocument/2006/math" xmlns:v="urn:schemas-microsoft-com:vml" xmlns:wp14="http://schemas.microsoft.com/office/word/2010/wordprocessingDrawing" xmlns:wp="http://schemas.openxmlformats.org/drawingml/2006/wordprocessingDrawing" xmlns:w10="urn:schemas-microsoft-com:office:word" xmlns:w="http://schemas.openxmlformats.org/wordprocessingml/2006/main" xmlns:w14="http://schemas.microsoft.com/office/word/2010/wordml" xmlns:w15="http://schemas.microsoft.com/office/word/2012/wordml" xmlns:w16cex="http://schemas.microsoft.com/office/word/2018/wordml/cex" xmlns:w16cid="http://schemas.microsoft.com/office/word/2016/wordml/cid" xmlns:w16="http://schemas.microsoft.com/office/word/2018/wordml" xmlns:w16du="http://schemas.microsoft.com/office/word/2023/wordml/word16du" xmlns:w16sdtdh="http://schemas.microsoft.com/office/word/2020/wordml/sdtdatahash" xmlns:w16sdtfl="http://schemas.microsoft.com/office/word/2024/wordml/sdtformatlock" xmlns:w16se="http://schemas.microsoft.com/office/word/2015/wordml/symex" xmlns:wpg="http://schemas.microsoft.com/office/word/2010/wordprocessingGroup" xmlns:wpi="http://schemas.microsoft.com/office/word/2010/wordprocessingInk" xmlns:wne="http://schemas.microsoft.com/office/word/2006/wordml" xmlns:wps="http://schemas.microsoft.com/office/word/2010/wordprocessingShape" mc:Ignorable="w14 w15 w16se w16cid w16 w16cex w16sdtdh w16sdtfl w16du wp14">
+  <w:abstractNum w:abstractNumId="0" w15:restartNumberingAfterBreak="0">
+    <w:nsid w:val="27A80752"/>
+    <w:multiLevelType w:val="hybridMultilevel"/>
+    <w:tmpl w:val="4470059A"/>
+    <w:lvl w:ilvl="0" w:tplc="AE22DE9A">
+      <w:numFmt w:val="bullet"/>
+      <w:lvlText w:val="-"/>
+      <w:lvlJc w:val="left"/>
+      <w:pPr>
+        <w:ind w:left="720" w:hanging="360"/>
+      </w:pPr>
+      <w:rPr>
+        <w:rFonts w:ascii="Calibri" w:eastAsiaTheme="minorHAnsi" w:hAnsi="Calibri" w:cs="Calibri" w:hint="default"/>
+      </w:rPr>
+    </w:lvl>
+    <w:lvl w:ilvl="1" w:tplc="04090003" w:tentative="1">
+      <w:start w:val="1"/>
+      <w:numFmt w:val="bullet"/>
+      <w:lvlText w:val="o"/>
+      <w:lvlJc w:val="left"/>
+      <w:pPr>
+        <w:ind w:left="1440" w:hanging="360"/>
+      </w:pPr>
+      <w:rPr>
+        <w:rFonts w:ascii="Courier New" w:hAnsi="Courier New" w:cs="Courier New" w:hint="default"/>
+      </w:rPr>
+    </w:lvl>
+    <w:lvl w:ilvl="2" w:tplc="04090005" w:tentative="1">
+      <w:start w:val="1"/>
+      <w:numFmt w:val="bullet"/>
+      <w:lvlText w:val=""/>
+      <w:lvlJc w:val="left"/>
+      <w:pPr>
+        <w:ind w:left="2160" w:hanging="360"/>
+      </w:pPr>
+      <w:rPr>
+        <w:rFonts w:ascii="Wingdings" w:hAnsi="Wingdings" w:hint="default"/>
+      </w:rPr>
+    </w:lvl>
+    <w:lvl w:ilvl="3" w:tplc="04090001" w:tentative="1">
+      <w:start w:val="1"/>
+      <w:numFmt w:val="bullet"/>
+      <w:lvlText w:val=""/>
+      <w:lvlJc w:val="left"/>
+      <w:pPr>
+        <w:ind w:left="2880" w:hanging="360"/>
+      </w:pPr>
+      <w:rPr>
+        <w:rFonts w:ascii="Symbol" w:hAnsi="Symbol" w:hint="default"/>
+      </w:rPr>
+    </w:lvl>
+    <w:lvl w:ilvl="4" w:tplc="04090003" w:tentative="1">
+      <w:start w:val="1"/>
+      <w:numFmt w:val="bullet"/>
+      <w:lvlText w:val="o"/>
+      <w:lvlJc w:val="left"/>
+      <w:pPr>
+        <w:ind w:left="3600" w:hanging="360"/>
+      </w:pPr>
+      <w:rPr>
+        <w:rFonts w:ascii="Courier New" w:hAnsi="Courier New" w:cs="Courier New" w:hint="default"/>
+      </w:rPr>
+    </w:lvl>
+    <w:lvl w:ilvl="5" w:tplc="04090005" w:tentative="1">
+      <w:start w:val="1"/>
+      <w:numFmt w:val="bullet"/>
+      <w:lvlText w:val=""/>
+      <w:lvlJc w:val="left"/>
+      <w:pPr>
+        <w:ind w:left="4320" w:hanging="360"/>
+      </w:pPr>
+      <w:rPr>
+        <w:rFonts w:ascii="Wingdings" w:hAnsi="Wingdings" w:hint="default"/>
+      </w:rPr>
+    </w:lvl>
+    <w:lvl w:ilvl="6" w:tplc="04090001" w:tentative="1">
+      <w:start w:val="1"/>
+      <w:numFmt w:val="bullet"/>
+      <w:lvlText w:val=""/>
+      <w:lvlJc w:val="left"/>
+      <w:pPr>
+        <w:ind w:left="5040" w:hanging="360"/>
+      </w:pPr>
+      <w:rPr>
+        <w:rFonts w:ascii="Symbol" w:hAnsi="Symbol" w:hint="default"/>
+      </w:rPr>
+    </w:lvl>
+    <w:lvl w:ilvl="7" w:tplc="04090003" w:tentative="1">
+      <w:start w:val="1"/>
+      <w:numFmt w:val="bullet"/>
+      <w:lvlText w:val="o"/>
+      <w:lvlJc w:val="left"/>
+      <w:pPr>
+        <w:ind w:left="5760" w:hanging="360"/>
+      </w:pPr>
+      <w:rPr>
+        <w:rFonts w:ascii="Courier New" w:hAnsi="Courier New" w:cs="Courier New" w:hint="default"/>
+      </w:rPr>
+    </w:lvl>
+    <w:lvl w:ilvl="8" w:tplc="04090005" w:tentative="1">
+      <w:start w:val="1"/>
+      <w:numFmt w:val="bullet"/>
+      <w:lvlText w:val=""/>
+      <w:lvlJc w:val="left"/>
+      <w:pPr>
+        <w:ind w:left="6480" w:hanging="360"/>
+      </w:pPr>
+      <w:rPr>
+        <w:rFonts w:ascii="Wingdings" w:hAnsi="Wingdings" w:hint="default"/>
+      </w:rPr>
+    </w:lvl>
+  </w:abstractNum>
+  <w:num w:numId="1" w16cid:durableId="1037240408">
+    <w:abstractNumId w:val="0"/>
+  </w:num>
+</w:numbering>
 </file>
 
 <file path=word/styles.xml><?xml version="1.0" encoding="utf-8"?>
@@ -679,6 +862,7 @@
   <w:style w:type="character" w:default="1" w:styleId="Standaardalinea-lettertype">
     <w:name w:val="Default Paragraph Font"/>
     <w:uiPriority w:val="1"/>
+    <w:semiHidden/>
     <w:unhideWhenUsed/>
   </w:style>
   <w:style w:type="table" w:default="1" w:styleId="Standaardtabel">

</xml_diff>

<commit_message>
Health & Score toegevoegd
</commit_message>
<xml_diff>
--- a/Docs/Logboek.docx
+++ b/Docs/Logboek.docx
@@ -26,108 +26,814 @@
     <w:p>
       <w:pPr>
         <w:rPr>
-          <w:lang w:val="nl-NL"/>
-        </w:rPr>
-      </w:pPr>
-      <w:r>
-        <w:rPr>
-          <w:lang w:val="nl-NL"/>
-        </w:rPr>
-        <w:t># Dag 1</w:t>
-      </w:r>
-    </w:p>
-    <w:p>
-      <w:pPr>
-        <w:rPr>
-          <w:lang w:val="nl-NL"/>
-        </w:rPr>
-      </w:pPr>
-      <w:r>
-        <w:rPr>
-          <w:lang w:val="nl-NL"/>
-        </w:rPr>
-        <w:t>- Unity project aangemaakt</w:t>
-      </w:r>
-      <w:r>
-        <w:rPr>
-          <w:lang w:val="nl-NL"/>
-        </w:rPr>
-        <w:br/>
-        <w:t>- Project gekoppeld aan GitHub</w:t>
-      </w:r>
-      <w:r>
-        <w:rPr>
-          <w:lang w:val="nl-NL"/>
-        </w:rPr>
-        <w:br/>
-        <w:t>- Folder structuur gemaakt</w:t>
-      </w:r>
-      <w:r>
-        <w:rPr>
-          <w:lang w:val="nl-NL"/>
-        </w:rPr>
-        <w:br/>
-        <w:t>- Player object gemaakt</w:t>
-      </w:r>
-      <w:r>
-        <w:rPr>
-          <w:lang w:val="nl-NL"/>
-        </w:rPr>
-        <w:br/>
-        <w:t>- Movement script toegevoegd</w:t>
-      </w:r>
-      <w:r>
-        <w:rPr>
-          <w:lang w:val="nl-NL"/>
-        </w:rPr>
-        <w:br/>
-        <w:t>- Input system fout opgelost</w:t>
-      </w:r>
-    </w:p>
-    <w:p>
-      <w:pPr>
-        <w:rPr>
-          <w:lang w:val="nl-NL"/>
-        </w:rPr>
-      </w:pPr>
-    </w:p>
-    <w:p>
-      <w:pPr>
-        <w:rPr>
-          <w:lang w:val="nl-NL"/>
-        </w:rPr>
-      </w:pPr>
-    </w:p>
-    <w:p>
-      <w:pPr>
-        <w:rPr>
-          <w:lang w:val="nl-NL"/>
-        </w:rPr>
-      </w:pPr>
-      <w:r>
-        <w:rPr>
-          <w:lang w:val="nl-NL"/>
-        </w:rPr>
-        <w:t># Dag 2</w:t>
-      </w:r>
-    </w:p>
-    <w:p>
-      <w:pPr>
-        <w:pStyle w:val="Lijstalinea"/>
-        <w:numPr>
-          <w:ilvl w:val="0"/>
-          <w:numId w:val="1"/>
-        </w:numPr>
-        <w:rPr>
-          <w:lang w:val="nl-NL"/>
-        </w:rPr>
-      </w:pPr>
-      <w:r>
-        <w:rPr>
-          <w:lang w:val="nl-NL"/>
-        </w:rPr>
-        <w:t>Enemy movement aangemaakt</w:t>
-      </w:r>
+          <w:b/>
+          <w:bCs/>
+          <w:lang w:val="nl-NL"/>
+        </w:rPr>
+      </w:pPr>
+      <w:r>
+        <w:rPr>
+          <w:b/>
+          <w:bCs/>
+          <w:lang w:val="nl-NL"/>
+        </w:rPr>
+        <w:t>Dag 1</w:t>
+      </w:r>
+    </w:p>
+    <w:p>
+      <w:pPr>
+        <w:rPr>
+          <w:b/>
+          <w:bCs/>
+          <w:lang w:val="nl-NL"/>
+        </w:rPr>
+      </w:pPr>
+      <w:r>
+        <w:rPr>
+          <w:b/>
+          <w:bCs/>
+          <w:lang w:val="nl-NL"/>
+        </w:rPr>
+        <w:t>Wat ik vandaag heb gedaan</w:t>
+      </w:r>
+    </w:p>
+    <w:p>
+      <w:pPr>
+        <w:numPr>
+          <w:ilvl w:val="0"/>
+          <w:numId w:val="6"/>
+        </w:numPr>
+      </w:pPr>
+      <w:r>
+        <w:t>Het examen doorgenomen en de opdrachten gelezen.</w:t>
+      </w:r>
+    </w:p>
+    <w:p>
+      <w:pPr>
+        <w:numPr>
+          <w:ilvl w:val="0"/>
+          <w:numId w:val="6"/>
+        </w:numPr>
+      </w:pPr>
+      <w:r>
+        <w:t>Een idee bedacht voor de game die ik wil maken in Unity.</w:t>
+      </w:r>
+    </w:p>
+    <w:p>
+      <w:pPr>
+        <w:numPr>
+          <w:ilvl w:val="0"/>
+          <w:numId w:val="6"/>
+        </w:numPr>
+      </w:pPr>
+      <w:r>
+        <w:t>Een GitHub repository aangemaakt voor het project.</w:t>
+      </w:r>
+    </w:p>
+    <w:p>
+      <w:pPr>
+        <w:numPr>
+          <w:ilvl w:val="0"/>
+          <w:numId w:val="6"/>
+        </w:numPr>
+      </w:pPr>
+      <w:r>
+        <w:t>Een nieuw Unity 2D project aangemaakt in de repository.</w:t>
+      </w:r>
+    </w:p>
+    <w:p>
+      <w:pPr>
+        <w:numPr>
+          <w:ilvl w:val="0"/>
+          <w:numId w:val="6"/>
+        </w:numPr>
+      </w:pPr>
+      <w:r>
+        <w:t>Een nette folderstructuur gemaakt binnen het project:</w:t>
+      </w:r>
+    </w:p>
+    <w:p>
+      <w:pPr>
+        <w:numPr>
+          <w:ilvl w:val="1"/>
+          <w:numId w:val="6"/>
+        </w:numPr>
+      </w:pPr>
+      <w:r>
+        <w:t>Scenes</w:t>
+      </w:r>
+    </w:p>
+    <w:p>
+      <w:pPr>
+        <w:numPr>
+          <w:ilvl w:val="1"/>
+          <w:numId w:val="6"/>
+        </w:numPr>
+      </w:pPr>
+      <w:r>
+        <w:t>Scripts</w:t>
+      </w:r>
+    </w:p>
+    <w:p>
+      <w:pPr>
+        <w:numPr>
+          <w:ilvl w:val="1"/>
+          <w:numId w:val="6"/>
+        </w:numPr>
+      </w:pPr>
+      <w:r>
+        <w:t>Sprites</w:t>
+      </w:r>
+    </w:p>
+    <w:p>
+      <w:pPr>
+        <w:numPr>
+          <w:ilvl w:val="1"/>
+          <w:numId w:val="6"/>
+        </w:numPr>
+      </w:pPr>
+      <w:r>
+        <w:t>Audio</w:t>
+      </w:r>
+    </w:p>
+    <w:p>
+      <w:pPr>
+        <w:numPr>
+          <w:ilvl w:val="0"/>
+          <w:numId w:val="6"/>
+        </w:numPr>
+      </w:pPr>
+      <w:r>
+        <w:t>De eerste scene aangemaakt voor de game.</w:t>
+      </w:r>
+    </w:p>
+    <w:p>
+      <w:pPr>
+        <w:numPr>
+          <w:ilvl w:val="0"/>
+          <w:numId w:val="6"/>
+        </w:numPr>
+      </w:pPr>
+      <w:r>
+        <w:t>Een Player object toegevoegd aan de scene.</w:t>
+      </w:r>
+    </w:p>
+    <w:p>
+      <w:pPr>
+        <w:numPr>
+          <w:ilvl w:val="0"/>
+          <w:numId w:val="6"/>
+        </w:numPr>
+      </w:pPr>
+      <w:r>
+        <w:t>Het eerste movement script geschreven zodat de speler kan bewegen met WASD en de pijltjestoetsen.</w:t>
+      </w:r>
+    </w:p>
+    <w:p>
+      <w:pPr>
+        <w:numPr>
+          <w:ilvl w:val="0"/>
+          <w:numId w:val="6"/>
+        </w:numPr>
+      </w:pPr>
+      <w:r>
+        <w:t>Het movement script gekoppeld aan het Player object.</w:t>
+      </w:r>
+    </w:p>
+    <w:p>
+      <w:pPr>
+        <w:rPr>
+          <w:b/>
+          <w:bCs/>
+        </w:rPr>
+      </w:pPr>
+      <w:r>
+        <w:rPr>
+          <w:b/>
+          <w:bCs/>
+        </w:rPr>
+        <w:t>Problemen / uitdagingen</w:t>
+      </w:r>
+    </w:p>
+    <w:p>
+      <w:pPr>
+        <w:numPr>
+          <w:ilvl w:val="0"/>
+          <w:numId w:val="7"/>
+        </w:numPr>
+      </w:pPr>
+      <w:r>
+        <w:t>Ik kreeg een foutmelding met het nieuwe Unity Input System.</w:t>
+      </w:r>
+    </w:p>
+    <w:p>
+      <w:pPr>
+        <w:numPr>
+          <w:ilvl w:val="0"/>
+          <w:numId w:val="7"/>
+        </w:numPr>
+      </w:pPr>
+      <w:r>
+        <w:t>Na onderzoek heb ik dit opgelost door de Input instellingen aan te passen naar de oude Input Manager/Both optie.</w:t>
+      </w:r>
+    </w:p>
+    <w:p>
+      <w:pPr>
+        <w:numPr>
+          <w:ilvl w:val="0"/>
+          <w:numId w:val="7"/>
+        </w:numPr>
+      </w:pPr>
+      <w:r>
+        <w:t>Ik had eerst per ongeluk een verkeerde Unity scene aangemaakt, waardoor bestanden op de verkeerde plek terecht kwamen.</w:t>
+      </w:r>
+    </w:p>
+    <w:p>
+      <w:pPr>
+        <w:rPr>
+          <w:b/>
+          <w:bCs/>
+        </w:rPr>
+      </w:pPr>
+      <w:r>
+        <w:rPr>
+          <w:b/>
+          <w:bCs/>
+        </w:rPr>
+        <w:t>Wat ik heb geleerd</w:t>
+      </w:r>
+    </w:p>
+    <w:p>
+      <w:pPr>
+        <w:numPr>
+          <w:ilvl w:val="0"/>
+          <w:numId w:val="8"/>
+        </w:numPr>
+      </w:pPr>
+      <w:r>
+        <w:t>Hoe Unity projecten zijn opgebouwd.</w:t>
+      </w:r>
+    </w:p>
+    <w:p>
+      <w:pPr>
+        <w:numPr>
+          <w:ilvl w:val="0"/>
+          <w:numId w:val="8"/>
+        </w:numPr>
+      </w:pPr>
+      <w:r>
+        <w:lastRenderedPageBreak/>
+        <w:t>Hoe scripts gekoppeld worden aan GameObjects.</w:t>
+      </w:r>
+    </w:p>
+    <w:p>
+      <w:pPr>
+        <w:numPr>
+          <w:ilvl w:val="0"/>
+          <w:numId w:val="8"/>
+        </w:numPr>
+      </w:pPr>
+      <w:r>
+        <w:t>Hoe player movement werkt in Unity met Input.GetAxis().</w:t>
+      </w:r>
+    </w:p>
+    <w:p>
+      <w:pPr>
+        <w:numPr>
+          <w:ilvl w:val="0"/>
+          <w:numId w:val="8"/>
+        </w:numPr>
+      </w:pPr>
+      <w:r>
+        <w:t>Hoe GitHub gebruikt wordt samen met Unity.</w:t>
+      </w:r>
+    </w:p>
+    <w:p>
+      <w:pPr>
+        <w:rPr>
+          <w:b/>
+          <w:bCs/>
+        </w:rPr>
+      </w:pPr>
+      <w:r>
+        <w:rPr>
+          <w:b/>
+          <w:bCs/>
+        </w:rPr>
+        <w:t>Wat ik morgen wil doen</w:t>
+      </w:r>
+    </w:p>
+    <w:p>
+      <w:pPr>
+        <w:numPr>
+          <w:ilvl w:val="0"/>
+          <w:numId w:val="9"/>
+        </w:numPr>
+      </w:pPr>
+      <w:r>
+        <w:t>Enemies toevoegen.</w:t>
+      </w:r>
+    </w:p>
+    <w:p>
+      <w:pPr>
+        <w:numPr>
+          <w:ilvl w:val="0"/>
+          <w:numId w:val="9"/>
+        </w:numPr>
+      </w:pPr>
+      <w:r>
+        <w:t>Collision systeem maken.</w:t>
+      </w:r>
+    </w:p>
+    <w:p>
+      <w:pPr>
+        <w:numPr>
+          <w:ilvl w:val="0"/>
+          <w:numId w:val="9"/>
+        </w:numPr>
+      </w:pPr>
+      <w:r>
+        <w:t>Een game over systeem bouwen.</w:t>
+      </w:r>
+    </w:p>
+    <w:p>
+      <w:pPr>
+        <w:numPr>
+          <w:ilvl w:val="0"/>
+          <w:numId w:val="9"/>
+        </w:numPr>
+      </w:pPr>
+      <w:r>
+        <w:t>Een restart systeem toevoegen.</w:t>
+      </w:r>
+    </w:p>
+    <w:p>
+      <w:pPr>
+        <w:numPr>
+          <w:ilvl w:val="0"/>
+          <w:numId w:val="9"/>
+        </w:numPr>
+      </w:pPr>
+      <w:r>
+        <w:t>Beginnen met enemy spawning.</w:t>
+      </w:r>
+    </w:p>
+    <w:p>
+      <w:pPr>
+        <w:rPr>
+          <w:lang w:val="nl-NL"/>
+        </w:rPr>
+      </w:pPr>
+    </w:p>
+    <w:p>
+      <w:pPr>
+        <w:rPr>
+          <w:lang w:val="nl-NL"/>
+        </w:rPr>
+      </w:pPr>
+    </w:p>
+    <w:p>
+      <w:pPr>
+        <w:rPr>
+          <w:b/>
+          <w:bCs/>
+          <w:lang w:val="nl-NL"/>
+        </w:rPr>
+      </w:pPr>
+      <w:r>
+        <w:rPr>
+          <w:b/>
+          <w:bCs/>
+          <w:lang w:val="nl-NL"/>
+        </w:rPr>
+        <w:t>Dag 2</w:t>
+      </w:r>
+    </w:p>
+    <w:p>
+      <w:pPr>
+        <w:rPr>
+          <w:b/>
+          <w:bCs/>
+          <w:lang w:val="nl-NL"/>
+        </w:rPr>
+      </w:pPr>
+      <w:r>
+        <w:rPr>
+          <w:b/>
+          <w:bCs/>
+          <w:lang w:val="nl-NL"/>
+        </w:rPr>
+        <w:t>Wat ik vandaag heb gedaan</w:t>
+      </w:r>
+    </w:p>
+    <w:p>
+      <w:pPr>
+        <w:numPr>
+          <w:ilvl w:val="0"/>
+          <w:numId w:val="2"/>
+        </w:numPr>
+        <w:rPr>
+          <w:lang w:val="nl-NL"/>
+        </w:rPr>
+      </w:pPr>
+      <w:r>
+        <w:rPr>
+          <w:lang w:val="nl-NL"/>
+        </w:rPr>
+        <w:t>Verder gewerkt aan de basis van de game in Unity.</w:t>
+      </w:r>
+    </w:p>
+    <w:p>
+      <w:pPr>
+        <w:numPr>
+          <w:ilvl w:val="0"/>
+          <w:numId w:val="2"/>
+        </w:numPr>
+        <w:rPr>
+          <w:lang w:val="nl-NL"/>
+        </w:rPr>
+      </w:pPr>
+      <w:r>
+        <w:rPr>
+          <w:lang w:val="nl-NL"/>
+        </w:rPr>
+        <w:t>Een Player object gemaakt in de Game scene.</w:t>
+      </w:r>
+    </w:p>
+    <w:p>
+      <w:pPr>
+        <w:numPr>
+          <w:ilvl w:val="0"/>
+          <w:numId w:val="2"/>
+        </w:numPr>
+        <w:rPr>
+          <w:lang w:val="nl-NL"/>
+        </w:rPr>
+      </w:pPr>
+      <w:r>
+        <w:rPr>
+          <w:lang w:val="nl-NL"/>
+        </w:rPr>
+        <w:t>Een movement script toegevoegd zodat de speler kan bewegen met WASD en de pijltjestoetsen.</w:t>
+      </w:r>
+    </w:p>
+    <w:p>
+      <w:pPr>
+        <w:numPr>
+          <w:ilvl w:val="0"/>
+          <w:numId w:val="2"/>
+        </w:numPr>
+        <w:rPr>
+          <w:lang w:val="nl-NL"/>
+        </w:rPr>
+      </w:pPr>
+      <w:r>
+        <w:rPr>
+          <w:lang w:val="nl-NL"/>
+        </w:rPr>
+        <w:t>Een fout opgelost met het Unity Input System.</w:t>
+      </w:r>
+    </w:p>
+    <w:p>
+      <w:pPr>
+        <w:numPr>
+          <w:ilvl w:val="0"/>
+          <w:numId w:val="2"/>
+        </w:numPr>
+        <w:rPr>
+          <w:lang w:val="nl-NL"/>
+        </w:rPr>
+      </w:pPr>
+      <w:r>
+        <w:rPr>
+          <w:lang w:val="nl-NL"/>
+        </w:rPr>
+        <w:t>Een Enemy object toegevoegd dat naar beneden beweegt.</w:t>
+      </w:r>
+    </w:p>
+    <w:p>
+      <w:pPr>
+        <w:numPr>
+          <w:ilvl w:val="0"/>
+          <w:numId w:val="2"/>
+        </w:numPr>
+        <w:rPr>
+          <w:lang w:val="nl-NL"/>
+        </w:rPr>
+      </w:pPr>
+      <w:r>
+        <w:rPr>
+          <w:lang w:val="nl-NL"/>
+        </w:rPr>
+        <w:t>Collision toegevoegd tussen de speler en enemies.</w:t>
+      </w:r>
+    </w:p>
+    <w:p>
+      <w:pPr>
+        <w:numPr>
+          <w:ilvl w:val="0"/>
+          <w:numId w:val="2"/>
+        </w:numPr>
+        <w:rPr>
+          <w:lang w:val="nl-NL"/>
+        </w:rPr>
+      </w:pPr>
+      <w:r>
+        <w:rPr>
+          <w:lang w:val="nl-NL"/>
+        </w:rPr>
+        <w:t>Een GameManager gemaakt voor de game logica.</w:t>
+      </w:r>
+    </w:p>
+    <w:p>
+      <w:pPr>
+        <w:numPr>
+          <w:ilvl w:val="0"/>
+          <w:numId w:val="2"/>
+        </w:numPr>
+        <w:rPr>
+          <w:lang w:val="nl-NL"/>
+        </w:rPr>
+      </w:pPr>
+      <w:r>
+        <w:rPr>
+          <w:lang w:val="nl-NL"/>
+        </w:rPr>
+        <w:t>Een game over systeem toegevoegd.</w:t>
+      </w:r>
+    </w:p>
+    <w:p>
+      <w:pPr>
+        <w:numPr>
+          <w:ilvl w:val="0"/>
+          <w:numId w:val="2"/>
+        </w:numPr>
+        <w:rPr>
+          <w:lang w:val="nl-NL"/>
+        </w:rPr>
+      </w:pPr>
+      <w:r>
+        <w:rPr>
+          <w:lang w:val="nl-NL"/>
+        </w:rPr>
+        <w:t>Een restart systeem toegevoegd zodat de game opnieuw start na een botsing.</w:t>
+      </w:r>
+    </w:p>
+    <w:p>
+      <w:pPr>
+        <w:numPr>
+          <w:ilvl w:val="0"/>
+          <w:numId w:val="2"/>
+        </w:numPr>
+        <w:rPr>
+          <w:lang w:val="nl-NL"/>
+        </w:rPr>
+      </w:pPr>
+      <w:r>
+        <w:rPr>
+          <w:lang w:val="nl-NL"/>
+        </w:rPr>
+        <w:t>Een enemy spawner gemaakt die automatisch enemies laat verschijnen op willekeurige locaties.</w:t>
+      </w:r>
+    </w:p>
+    <w:p>
+      <w:pPr>
+        <w:numPr>
+          <w:ilvl w:val="0"/>
+          <w:numId w:val="2"/>
+        </w:numPr>
+        <w:rPr>
+          <w:lang w:val="nl-NL"/>
+        </w:rPr>
+      </w:pPr>
+      <w:r>
+        <w:rPr>
+          <w:lang w:val="nl-NL"/>
+        </w:rPr>
+        <w:t>Van de Enemy een prefab gemaakt zodat meerdere enemies gespawned kunnen worden.</w:t>
+      </w:r>
+    </w:p>
+    <w:p>
+      <w:pPr>
+        <w:rPr>
+          <w:b/>
+          <w:bCs/>
+        </w:rPr>
+      </w:pPr>
+      <w:r>
+        <w:rPr>
+          <w:b/>
+          <w:bCs/>
+        </w:rPr>
+        <w:lastRenderedPageBreak/>
+        <w:t>Problemen / uitdagingen</w:t>
+      </w:r>
+    </w:p>
+    <w:p>
+      <w:pPr>
+        <w:numPr>
+          <w:ilvl w:val="0"/>
+          <w:numId w:val="3"/>
+        </w:numPr>
+        <w:rPr>
+          <w:lang w:val="nl-NL"/>
+        </w:rPr>
+      </w:pPr>
+      <w:r>
+        <w:rPr>
+          <w:lang w:val="nl-NL"/>
+        </w:rPr>
+        <w:t>Eerst werkte de collision niet goed omdat de Enemy tag niet correct was toegewezen.</w:t>
+      </w:r>
+    </w:p>
+    <w:p>
+      <w:pPr>
+        <w:numPr>
+          <w:ilvl w:val="0"/>
+          <w:numId w:val="3"/>
+        </w:numPr>
+        <w:rPr>
+          <w:lang w:val="nl-NL"/>
+        </w:rPr>
+      </w:pPr>
+      <w:r>
+        <w:rPr>
+          <w:lang w:val="nl-NL"/>
+        </w:rPr>
+        <w:t>Ook had ik per ongeluk een verkeerde Unity scene aangemaakt, waardoor objecten niet goed werden opgeslagen.</w:t>
+      </w:r>
+    </w:p>
+    <w:p>
+      <w:pPr>
+        <w:numPr>
+          <w:ilvl w:val="0"/>
+          <w:numId w:val="3"/>
+        </w:numPr>
+      </w:pPr>
+      <w:r>
+        <w:rPr>
+          <w:lang w:val="nl-NL"/>
+        </w:rPr>
+        <w:t xml:space="preserve">Git duurde lang met uploaden omdat Unity cache bestanden werden meegenomen. </w:t>
+      </w:r>
+      <w:r>
+        <w:t>Dit opgelost met een .gitignore bestand.</w:t>
+      </w:r>
+    </w:p>
+    <w:p>
+      <w:pPr>
+        <w:rPr>
+          <w:b/>
+          <w:bCs/>
+        </w:rPr>
+      </w:pPr>
+      <w:r>
+        <w:rPr>
+          <w:b/>
+          <w:bCs/>
+        </w:rPr>
+        <w:t>Wat ik heb geleerd</w:t>
+      </w:r>
+    </w:p>
+    <w:p>
+      <w:pPr>
+        <w:numPr>
+          <w:ilvl w:val="0"/>
+          <w:numId w:val="4"/>
+        </w:numPr>
+        <w:rPr>
+          <w:lang w:val="nl-NL"/>
+        </w:rPr>
+      </w:pPr>
+      <w:r>
+        <w:rPr>
+          <w:lang w:val="nl-NL"/>
+        </w:rPr>
+        <w:t>Hoe colliders en Rigidbody2D werken in Unity.</w:t>
+      </w:r>
+    </w:p>
+    <w:p>
+      <w:pPr>
+        <w:numPr>
+          <w:ilvl w:val="0"/>
+          <w:numId w:val="4"/>
+        </w:numPr>
+        <w:rPr>
+          <w:lang w:val="nl-NL"/>
+        </w:rPr>
+      </w:pPr>
+      <w:r>
+        <w:rPr>
+          <w:lang w:val="nl-NL"/>
+        </w:rPr>
+        <w:t>Hoe tags gebruikt worden voor collision detectie.</w:t>
+      </w:r>
+    </w:p>
+    <w:p>
+      <w:pPr>
+        <w:numPr>
+          <w:ilvl w:val="0"/>
+          <w:numId w:val="4"/>
+        </w:numPr>
+      </w:pPr>
+      <w:r>
+        <w:t>Hoe prefabs werken.</w:t>
+      </w:r>
+    </w:p>
+    <w:p>
+      <w:pPr>
+        <w:numPr>
+          <w:ilvl w:val="0"/>
+          <w:numId w:val="4"/>
+        </w:numPr>
+        <w:rPr>
+          <w:lang w:val="nl-NL"/>
+        </w:rPr>
+      </w:pPr>
+      <w:r>
+        <w:rPr>
+          <w:lang w:val="nl-NL"/>
+        </w:rPr>
+        <w:t>Hoe scripts gekoppeld worden aan GameObjects.</w:t>
+      </w:r>
+    </w:p>
+    <w:p>
+      <w:pPr>
+        <w:rPr>
+          <w:b/>
+          <w:bCs/>
+        </w:rPr>
+      </w:pPr>
+      <w:r>
+        <w:rPr>
+          <w:b/>
+          <w:bCs/>
+        </w:rPr>
+        <w:t>Wat ik morgen wil doen</w:t>
+      </w:r>
+    </w:p>
+    <w:p>
+      <w:pPr>
+        <w:numPr>
+          <w:ilvl w:val="0"/>
+          <w:numId w:val="5"/>
+        </w:numPr>
+      </w:pPr>
+      <w:r>
+        <w:t>Score systeem maken.</w:t>
+      </w:r>
+    </w:p>
+    <w:p>
+      <w:pPr>
+        <w:numPr>
+          <w:ilvl w:val="0"/>
+          <w:numId w:val="5"/>
+        </w:numPr>
+      </w:pPr>
+      <w:r>
+        <w:t>Start menu toevoegen.</w:t>
+      </w:r>
+    </w:p>
+    <w:p>
+      <w:pPr>
+        <w:numPr>
+          <w:ilvl w:val="0"/>
+          <w:numId w:val="5"/>
+        </w:numPr>
+        <w:rPr>
+          <w:lang w:val="nl-NL"/>
+        </w:rPr>
+      </w:pPr>
+      <w:r>
+        <w:rPr>
+          <w:lang w:val="nl-NL"/>
+        </w:rPr>
+        <w:t>Best Education logo en slogan toevoegen.</w:t>
+      </w:r>
+    </w:p>
+    <w:p>
+      <w:pPr>
+        <w:numPr>
+          <w:ilvl w:val="0"/>
+          <w:numId w:val="5"/>
+        </w:numPr>
+        <w:rPr>
+          <w:lang w:val="nl-NL"/>
+        </w:rPr>
+      </w:pPr>
+      <w:r>
+        <w:rPr>
+          <w:lang w:val="nl-NL"/>
+        </w:rPr>
+        <w:t>De game moeilijker maken naarmate de speler langer overleeft.</w:t>
+      </w:r>
+    </w:p>
+    <w:p>
+      <w:pPr>
+        <w:rPr>
+          <w:lang w:val="nl-NL"/>
+        </w:rPr>
+      </w:pPr>
     </w:p>
     <w:sectPr>
       <w:pgSz w:w="12240" w:h="15840"/>
@@ -142,6 +848,304 @@
 <file path=word/numbering.xml><?xml version="1.0" encoding="utf-8"?>
 <w:numbering xmlns:wpc="http://schemas.microsoft.com/office/word/2010/wordprocessingCanvas" xmlns:cx="http://schemas.microsoft.com/office/drawing/2014/chartex" xmlns:cx1="http://schemas.microsoft.com/office/drawing/2015/9/8/chartex" xmlns:cx2="http://schemas.microsoft.com/office/drawing/2015/10/21/chartex" xmlns:cx3="http://schemas.microsoft.com/office/drawing/2016/5/9/chartex" xmlns:cx4="http://schemas.microsoft.com/office/drawing/2016/5/10/chartex" xmlns:cx5="http://schemas.microsoft.com/office/drawing/2016/5/11/chartex" xmlns:cx6="http://schemas.microsoft.com/office/drawing/2016/5/12/chartex" xmlns:cx7="http://schemas.microsoft.com/office/drawing/2016/5/13/chartex" xmlns:cx8="http://schemas.microsoft.com/office/drawing/2016/5/14/chartex" xmlns:mc="http://schemas.openxmlformats.org/markup-compatibility/2006" xmlns:aink="http://schemas.microsoft.com/office/drawing/2016/ink" xmlns:am3d="http://schemas.microsoft.com/office/drawing/2017/model3d" xmlns:o="urn:schemas-microsoft-com:office:office" xmlns:oel="http://schemas.microsoft.com/office/2019/extlst" xmlns:r="http://schemas.openxmlformats.org/officeDocument/2006/relationships" xmlns:m="http://schemas.openxmlformats.org/officeDocument/2006/math" xmlns:v="urn:schemas-microsoft-com:vml" xmlns:wp14="http://schemas.microsoft.com/office/word/2010/wordprocessingDrawing" xmlns:wp="http://schemas.openxmlformats.org/drawingml/2006/wordprocessingDrawing" xmlns:w10="urn:schemas-microsoft-com:office:word" xmlns:w="http://schemas.openxmlformats.org/wordprocessingml/2006/main" xmlns:w14="http://schemas.microsoft.com/office/word/2010/wordml" xmlns:w15="http://schemas.microsoft.com/office/word/2012/wordml" xmlns:w16cex="http://schemas.microsoft.com/office/word/2018/wordml/cex" xmlns:w16cid="http://schemas.microsoft.com/office/word/2016/wordml/cid" xmlns:w16="http://schemas.microsoft.com/office/word/2018/wordml" xmlns:w16du="http://schemas.microsoft.com/office/word/2023/wordml/word16du" xmlns:w16sdtdh="http://schemas.microsoft.com/office/word/2020/wordml/sdtdatahash" xmlns:w16sdtfl="http://schemas.microsoft.com/office/word/2024/wordml/sdtformatlock" xmlns:w16se="http://schemas.microsoft.com/office/word/2015/wordml/symex" xmlns:wpg="http://schemas.microsoft.com/office/word/2010/wordprocessingGroup" xmlns:wpi="http://schemas.microsoft.com/office/word/2010/wordprocessingInk" xmlns:wne="http://schemas.microsoft.com/office/word/2006/wordml" xmlns:wps="http://schemas.microsoft.com/office/word/2010/wordprocessingShape" mc:Ignorable="w14 w15 w16se w16cid w16 w16cex w16sdtdh w16sdtfl w16du wp14">
   <w:abstractNum w:abstractNumId="0" w15:restartNumberingAfterBreak="0">
+    <w:nsid w:val="0C850723"/>
+    <w:multiLevelType w:val="multilevel"/>
+    <w:tmpl w:val="19727A42"/>
+    <w:lvl w:ilvl="0">
+      <w:start w:val="1"/>
+      <w:numFmt w:val="bullet"/>
+      <w:lvlText w:val=""/>
+      <w:lvlJc w:val="left"/>
+      <w:pPr>
+        <w:tabs>
+          <w:tab w:val="num" w:pos="720"/>
+        </w:tabs>
+        <w:ind w:left="720" w:hanging="360"/>
+      </w:pPr>
+      <w:rPr>
+        <w:rFonts w:ascii="Symbol" w:hAnsi="Symbol" w:hint="default"/>
+        <w:sz w:val="20"/>
+      </w:rPr>
+    </w:lvl>
+    <w:lvl w:ilvl="1" w:tentative="1">
+      <w:start w:val="1"/>
+      <w:numFmt w:val="bullet"/>
+      <w:lvlText w:val="o"/>
+      <w:lvlJc w:val="left"/>
+      <w:pPr>
+        <w:tabs>
+          <w:tab w:val="num" w:pos="1440"/>
+        </w:tabs>
+        <w:ind w:left="1440" w:hanging="360"/>
+      </w:pPr>
+      <w:rPr>
+        <w:rFonts w:ascii="Courier New" w:hAnsi="Courier New" w:hint="default"/>
+        <w:sz w:val="20"/>
+      </w:rPr>
+    </w:lvl>
+    <w:lvl w:ilvl="2" w:tentative="1">
+      <w:start w:val="1"/>
+      <w:numFmt w:val="bullet"/>
+      <w:lvlText w:val=""/>
+      <w:lvlJc w:val="left"/>
+      <w:pPr>
+        <w:tabs>
+          <w:tab w:val="num" w:pos="2160"/>
+        </w:tabs>
+        <w:ind w:left="2160" w:hanging="360"/>
+      </w:pPr>
+      <w:rPr>
+        <w:rFonts w:ascii="Wingdings" w:hAnsi="Wingdings" w:hint="default"/>
+        <w:sz w:val="20"/>
+      </w:rPr>
+    </w:lvl>
+    <w:lvl w:ilvl="3" w:tentative="1">
+      <w:start w:val="1"/>
+      <w:numFmt w:val="bullet"/>
+      <w:lvlText w:val=""/>
+      <w:lvlJc w:val="left"/>
+      <w:pPr>
+        <w:tabs>
+          <w:tab w:val="num" w:pos="2880"/>
+        </w:tabs>
+        <w:ind w:left="2880" w:hanging="360"/>
+      </w:pPr>
+      <w:rPr>
+        <w:rFonts w:ascii="Wingdings" w:hAnsi="Wingdings" w:hint="default"/>
+        <w:sz w:val="20"/>
+      </w:rPr>
+    </w:lvl>
+    <w:lvl w:ilvl="4" w:tentative="1">
+      <w:start w:val="1"/>
+      <w:numFmt w:val="bullet"/>
+      <w:lvlText w:val=""/>
+      <w:lvlJc w:val="left"/>
+      <w:pPr>
+        <w:tabs>
+          <w:tab w:val="num" w:pos="3600"/>
+        </w:tabs>
+        <w:ind w:left="3600" w:hanging="360"/>
+      </w:pPr>
+      <w:rPr>
+        <w:rFonts w:ascii="Wingdings" w:hAnsi="Wingdings" w:hint="default"/>
+        <w:sz w:val="20"/>
+      </w:rPr>
+    </w:lvl>
+    <w:lvl w:ilvl="5" w:tentative="1">
+      <w:start w:val="1"/>
+      <w:numFmt w:val="bullet"/>
+      <w:lvlText w:val=""/>
+      <w:lvlJc w:val="left"/>
+      <w:pPr>
+        <w:tabs>
+          <w:tab w:val="num" w:pos="4320"/>
+        </w:tabs>
+        <w:ind w:left="4320" w:hanging="360"/>
+      </w:pPr>
+      <w:rPr>
+        <w:rFonts w:ascii="Wingdings" w:hAnsi="Wingdings" w:hint="default"/>
+        <w:sz w:val="20"/>
+      </w:rPr>
+    </w:lvl>
+    <w:lvl w:ilvl="6" w:tentative="1">
+      <w:start w:val="1"/>
+      <w:numFmt w:val="bullet"/>
+      <w:lvlText w:val=""/>
+      <w:lvlJc w:val="left"/>
+      <w:pPr>
+        <w:tabs>
+          <w:tab w:val="num" w:pos="5040"/>
+        </w:tabs>
+        <w:ind w:left="5040" w:hanging="360"/>
+      </w:pPr>
+      <w:rPr>
+        <w:rFonts w:ascii="Wingdings" w:hAnsi="Wingdings" w:hint="default"/>
+        <w:sz w:val="20"/>
+      </w:rPr>
+    </w:lvl>
+    <w:lvl w:ilvl="7" w:tentative="1">
+      <w:start w:val="1"/>
+      <w:numFmt w:val="bullet"/>
+      <w:lvlText w:val=""/>
+      <w:lvlJc w:val="left"/>
+      <w:pPr>
+        <w:tabs>
+          <w:tab w:val="num" w:pos="5760"/>
+        </w:tabs>
+        <w:ind w:left="5760" w:hanging="360"/>
+      </w:pPr>
+      <w:rPr>
+        <w:rFonts w:ascii="Wingdings" w:hAnsi="Wingdings" w:hint="default"/>
+        <w:sz w:val="20"/>
+      </w:rPr>
+    </w:lvl>
+    <w:lvl w:ilvl="8" w:tentative="1">
+      <w:start w:val="1"/>
+      <w:numFmt w:val="bullet"/>
+      <w:lvlText w:val=""/>
+      <w:lvlJc w:val="left"/>
+      <w:pPr>
+        <w:tabs>
+          <w:tab w:val="num" w:pos="6480"/>
+        </w:tabs>
+        <w:ind w:left="6480" w:hanging="360"/>
+      </w:pPr>
+      <w:rPr>
+        <w:rFonts w:ascii="Wingdings" w:hAnsi="Wingdings" w:hint="default"/>
+        <w:sz w:val="20"/>
+      </w:rPr>
+    </w:lvl>
+  </w:abstractNum>
+  <w:abstractNum w:abstractNumId="1" w15:restartNumberingAfterBreak="0">
+    <w:nsid w:val="186C26BE"/>
+    <w:multiLevelType w:val="multilevel"/>
+    <w:tmpl w:val="1F7898B0"/>
+    <w:lvl w:ilvl="0">
+      <w:start w:val="1"/>
+      <w:numFmt w:val="bullet"/>
+      <w:lvlText w:val=""/>
+      <w:lvlJc w:val="left"/>
+      <w:pPr>
+        <w:tabs>
+          <w:tab w:val="num" w:pos="720"/>
+        </w:tabs>
+        <w:ind w:left="720" w:hanging="360"/>
+      </w:pPr>
+      <w:rPr>
+        <w:rFonts w:ascii="Symbol" w:hAnsi="Symbol" w:hint="default"/>
+        <w:sz w:val="20"/>
+      </w:rPr>
+    </w:lvl>
+    <w:lvl w:ilvl="1" w:tentative="1">
+      <w:start w:val="1"/>
+      <w:numFmt w:val="bullet"/>
+      <w:lvlText w:val="o"/>
+      <w:lvlJc w:val="left"/>
+      <w:pPr>
+        <w:tabs>
+          <w:tab w:val="num" w:pos="1440"/>
+        </w:tabs>
+        <w:ind w:left="1440" w:hanging="360"/>
+      </w:pPr>
+      <w:rPr>
+        <w:rFonts w:ascii="Courier New" w:hAnsi="Courier New" w:hint="default"/>
+        <w:sz w:val="20"/>
+      </w:rPr>
+    </w:lvl>
+    <w:lvl w:ilvl="2" w:tentative="1">
+      <w:start w:val="1"/>
+      <w:numFmt w:val="bullet"/>
+      <w:lvlText w:val=""/>
+      <w:lvlJc w:val="left"/>
+      <w:pPr>
+        <w:tabs>
+          <w:tab w:val="num" w:pos="2160"/>
+        </w:tabs>
+        <w:ind w:left="2160" w:hanging="360"/>
+      </w:pPr>
+      <w:rPr>
+        <w:rFonts w:ascii="Wingdings" w:hAnsi="Wingdings" w:hint="default"/>
+        <w:sz w:val="20"/>
+      </w:rPr>
+    </w:lvl>
+    <w:lvl w:ilvl="3" w:tentative="1">
+      <w:start w:val="1"/>
+      <w:numFmt w:val="bullet"/>
+      <w:lvlText w:val=""/>
+      <w:lvlJc w:val="left"/>
+      <w:pPr>
+        <w:tabs>
+          <w:tab w:val="num" w:pos="2880"/>
+        </w:tabs>
+        <w:ind w:left="2880" w:hanging="360"/>
+      </w:pPr>
+      <w:rPr>
+        <w:rFonts w:ascii="Wingdings" w:hAnsi="Wingdings" w:hint="default"/>
+        <w:sz w:val="20"/>
+      </w:rPr>
+    </w:lvl>
+    <w:lvl w:ilvl="4" w:tentative="1">
+      <w:start w:val="1"/>
+      <w:numFmt w:val="bullet"/>
+      <w:lvlText w:val=""/>
+      <w:lvlJc w:val="left"/>
+      <w:pPr>
+        <w:tabs>
+          <w:tab w:val="num" w:pos="3600"/>
+        </w:tabs>
+        <w:ind w:left="3600" w:hanging="360"/>
+      </w:pPr>
+      <w:rPr>
+        <w:rFonts w:ascii="Wingdings" w:hAnsi="Wingdings" w:hint="default"/>
+        <w:sz w:val="20"/>
+      </w:rPr>
+    </w:lvl>
+    <w:lvl w:ilvl="5" w:tentative="1">
+      <w:start w:val="1"/>
+      <w:numFmt w:val="bullet"/>
+      <w:lvlText w:val=""/>
+      <w:lvlJc w:val="left"/>
+      <w:pPr>
+        <w:tabs>
+          <w:tab w:val="num" w:pos="4320"/>
+        </w:tabs>
+        <w:ind w:left="4320" w:hanging="360"/>
+      </w:pPr>
+      <w:rPr>
+        <w:rFonts w:ascii="Wingdings" w:hAnsi="Wingdings" w:hint="default"/>
+        <w:sz w:val="20"/>
+      </w:rPr>
+    </w:lvl>
+    <w:lvl w:ilvl="6" w:tentative="1">
+      <w:start w:val="1"/>
+      <w:numFmt w:val="bullet"/>
+      <w:lvlText w:val=""/>
+      <w:lvlJc w:val="left"/>
+      <w:pPr>
+        <w:tabs>
+          <w:tab w:val="num" w:pos="5040"/>
+        </w:tabs>
+        <w:ind w:left="5040" w:hanging="360"/>
+      </w:pPr>
+      <w:rPr>
+        <w:rFonts w:ascii="Wingdings" w:hAnsi="Wingdings" w:hint="default"/>
+        <w:sz w:val="20"/>
+      </w:rPr>
+    </w:lvl>
+    <w:lvl w:ilvl="7" w:tentative="1">
+      <w:start w:val="1"/>
+      <w:numFmt w:val="bullet"/>
+      <w:lvlText w:val=""/>
+      <w:lvlJc w:val="left"/>
+      <w:pPr>
+        <w:tabs>
+          <w:tab w:val="num" w:pos="5760"/>
+        </w:tabs>
+        <w:ind w:left="5760" w:hanging="360"/>
+      </w:pPr>
+      <w:rPr>
+        <w:rFonts w:ascii="Wingdings" w:hAnsi="Wingdings" w:hint="default"/>
+        <w:sz w:val="20"/>
+      </w:rPr>
+    </w:lvl>
+    <w:lvl w:ilvl="8" w:tentative="1">
+      <w:start w:val="1"/>
+      <w:numFmt w:val="bullet"/>
+      <w:lvlText w:val=""/>
+      <w:lvlJc w:val="left"/>
+      <w:pPr>
+        <w:tabs>
+          <w:tab w:val="num" w:pos="6480"/>
+        </w:tabs>
+        <w:ind w:left="6480" w:hanging="360"/>
+      </w:pPr>
+      <w:rPr>
+        <w:rFonts w:ascii="Wingdings" w:hAnsi="Wingdings" w:hint="default"/>
+        <w:sz w:val="20"/>
+      </w:rPr>
+    </w:lvl>
+  </w:abstractNum>
+  <w:abstractNum w:abstractNumId="2" w15:restartNumberingAfterBreak="0">
     <w:nsid w:val="27A80752"/>
     <w:multiLevelType w:val="hybridMultilevel"/>
     <w:tmpl w:val="4470059A"/>
@@ -253,7 +1257,925 @@
       </w:rPr>
     </w:lvl>
   </w:abstractNum>
+  <w:abstractNum w:abstractNumId="3" w15:restartNumberingAfterBreak="0">
+    <w:nsid w:val="30C10FC1"/>
+    <w:multiLevelType w:val="multilevel"/>
+    <w:tmpl w:val="0128C614"/>
+    <w:lvl w:ilvl="0">
+      <w:start w:val="1"/>
+      <w:numFmt w:val="bullet"/>
+      <w:lvlText w:val=""/>
+      <w:lvlJc w:val="left"/>
+      <w:pPr>
+        <w:tabs>
+          <w:tab w:val="num" w:pos="720"/>
+        </w:tabs>
+        <w:ind w:left="720" w:hanging="360"/>
+      </w:pPr>
+      <w:rPr>
+        <w:rFonts w:ascii="Symbol" w:hAnsi="Symbol" w:hint="default"/>
+        <w:sz w:val="20"/>
+      </w:rPr>
+    </w:lvl>
+    <w:lvl w:ilvl="1" w:tentative="1">
+      <w:start w:val="1"/>
+      <w:numFmt w:val="bullet"/>
+      <w:lvlText w:val="o"/>
+      <w:lvlJc w:val="left"/>
+      <w:pPr>
+        <w:tabs>
+          <w:tab w:val="num" w:pos="1440"/>
+        </w:tabs>
+        <w:ind w:left="1440" w:hanging="360"/>
+      </w:pPr>
+      <w:rPr>
+        <w:rFonts w:ascii="Courier New" w:hAnsi="Courier New" w:hint="default"/>
+        <w:sz w:val="20"/>
+      </w:rPr>
+    </w:lvl>
+    <w:lvl w:ilvl="2" w:tentative="1">
+      <w:start w:val="1"/>
+      <w:numFmt w:val="bullet"/>
+      <w:lvlText w:val=""/>
+      <w:lvlJc w:val="left"/>
+      <w:pPr>
+        <w:tabs>
+          <w:tab w:val="num" w:pos="2160"/>
+        </w:tabs>
+        <w:ind w:left="2160" w:hanging="360"/>
+      </w:pPr>
+      <w:rPr>
+        <w:rFonts w:ascii="Wingdings" w:hAnsi="Wingdings" w:hint="default"/>
+        <w:sz w:val="20"/>
+      </w:rPr>
+    </w:lvl>
+    <w:lvl w:ilvl="3" w:tentative="1">
+      <w:start w:val="1"/>
+      <w:numFmt w:val="bullet"/>
+      <w:lvlText w:val=""/>
+      <w:lvlJc w:val="left"/>
+      <w:pPr>
+        <w:tabs>
+          <w:tab w:val="num" w:pos="2880"/>
+        </w:tabs>
+        <w:ind w:left="2880" w:hanging="360"/>
+      </w:pPr>
+      <w:rPr>
+        <w:rFonts w:ascii="Wingdings" w:hAnsi="Wingdings" w:hint="default"/>
+        <w:sz w:val="20"/>
+      </w:rPr>
+    </w:lvl>
+    <w:lvl w:ilvl="4" w:tentative="1">
+      <w:start w:val="1"/>
+      <w:numFmt w:val="bullet"/>
+      <w:lvlText w:val=""/>
+      <w:lvlJc w:val="left"/>
+      <w:pPr>
+        <w:tabs>
+          <w:tab w:val="num" w:pos="3600"/>
+        </w:tabs>
+        <w:ind w:left="3600" w:hanging="360"/>
+      </w:pPr>
+      <w:rPr>
+        <w:rFonts w:ascii="Wingdings" w:hAnsi="Wingdings" w:hint="default"/>
+        <w:sz w:val="20"/>
+      </w:rPr>
+    </w:lvl>
+    <w:lvl w:ilvl="5" w:tentative="1">
+      <w:start w:val="1"/>
+      <w:numFmt w:val="bullet"/>
+      <w:lvlText w:val=""/>
+      <w:lvlJc w:val="left"/>
+      <w:pPr>
+        <w:tabs>
+          <w:tab w:val="num" w:pos="4320"/>
+        </w:tabs>
+        <w:ind w:left="4320" w:hanging="360"/>
+      </w:pPr>
+      <w:rPr>
+        <w:rFonts w:ascii="Wingdings" w:hAnsi="Wingdings" w:hint="default"/>
+        <w:sz w:val="20"/>
+      </w:rPr>
+    </w:lvl>
+    <w:lvl w:ilvl="6" w:tentative="1">
+      <w:start w:val="1"/>
+      <w:numFmt w:val="bullet"/>
+      <w:lvlText w:val=""/>
+      <w:lvlJc w:val="left"/>
+      <w:pPr>
+        <w:tabs>
+          <w:tab w:val="num" w:pos="5040"/>
+        </w:tabs>
+        <w:ind w:left="5040" w:hanging="360"/>
+      </w:pPr>
+      <w:rPr>
+        <w:rFonts w:ascii="Wingdings" w:hAnsi="Wingdings" w:hint="default"/>
+        <w:sz w:val="20"/>
+      </w:rPr>
+    </w:lvl>
+    <w:lvl w:ilvl="7" w:tentative="1">
+      <w:start w:val="1"/>
+      <w:numFmt w:val="bullet"/>
+      <w:lvlText w:val=""/>
+      <w:lvlJc w:val="left"/>
+      <w:pPr>
+        <w:tabs>
+          <w:tab w:val="num" w:pos="5760"/>
+        </w:tabs>
+        <w:ind w:left="5760" w:hanging="360"/>
+      </w:pPr>
+      <w:rPr>
+        <w:rFonts w:ascii="Wingdings" w:hAnsi="Wingdings" w:hint="default"/>
+        <w:sz w:val="20"/>
+      </w:rPr>
+    </w:lvl>
+    <w:lvl w:ilvl="8" w:tentative="1">
+      <w:start w:val="1"/>
+      <w:numFmt w:val="bullet"/>
+      <w:lvlText w:val=""/>
+      <w:lvlJc w:val="left"/>
+      <w:pPr>
+        <w:tabs>
+          <w:tab w:val="num" w:pos="6480"/>
+        </w:tabs>
+        <w:ind w:left="6480" w:hanging="360"/>
+      </w:pPr>
+      <w:rPr>
+        <w:rFonts w:ascii="Wingdings" w:hAnsi="Wingdings" w:hint="default"/>
+        <w:sz w:val="20"/>
+      </w:rPr>
+    </w:lvl>
+  </w:abstractNum>
+  <w:abstractNum w:abstractNumId="4" w15:restartNumberingAfterBreak="0">
+    <w:nsid w:val="40983662"/>
+    <w:multiLevelType w:val="multilevel"/>
+    <w:tmpl w:val="186EAC42"/>
+    <w:lvl w:ilvl="0">
+      <w:start w:val="1"/>
+      <w:numFmt w:val="bullet"/>
+      <w:lvlText w:val=""/>
+      <w:lvlJc w:val="left"/>
+      <w:pPr>
+        <w:tabs>
+          <w:tab w:val="num" w:pos="720"/>
+        </w:tabs>
+        <w:ind w:left="720" w:hanging="360"/>
+      </w:pPr>
+      <w:rPr>
+        <w:rFonts w:ascii="Symbol" w:hAnsi="Symbol" w:hint="default"/>
+        <w:sz w:val="20"/>
+      </w:rPr>
+    </w:lvl>
+    <w:lvl w:ilvl="1" w:tentative="1">
+      <w:start w:val="1"/>
+      <w:numFmt w:val="bullet"/>
+      <w:lvlText w:val="o"/>
+      <w:lvlJc w:val="left"/>
+      <w:pPr>
+        <w:tabs>
+          <w:tab w:val="num" w:pos="1440"/>
+        </w:tabs>
+        <w:ind w:left="1440" w:hanging="360"/>
+      </w:pPr>
+      <w:rPr>
+        <w:rFonts w:ascii="Courier New" w:hAnsi="Courier New" w:hint="default"/>
+        <w:sz w:val="20"/>
+      </w:rPr>
+    </w:lvl>
+    <w:lvl w:ilvl="2" w:tentative="1">
+      <w:start w:val="1"/>
+      <w:numFmt w:val="bullet"/>
+      <w:lvlText w:val=""/>
+      <w:lvlJc w:val="left"/>
+      <w:pPr>
+        <w:tabs>
+          <w:tab w:val="num" w:pos="2160"/>
+        </w:tabs>
+        <w:ind w:left="2160" w:hanging="360"/>
+      </w:pPr>
+      <w:rPr>
+        <w:rFonts w:ascii="Wingdings" w:hAnsi="Wingdings" w:hint="default"/>
+        <w:sz w:val="20"/>
+      </w:rPr>
+    </w:lvl>
+    <w:lvl w:ilvl="3" w:tentative="1">
+      <w:start w:val="1"/>
+      <w:numFmt w:val="bullet"/>
+      <w:lvlText w:val=""/>
+      <w:lvlJc w:val="left"/>
+      <w:pPr>
+        <w:tabs>
+          <w:tab w:val="num" w:pos="2880"/>
+        </w:tabs>
+        <w:ind w:left="2880" w:hanging="360"/>
+      </w:pPr>
+      <w:rPr>
+        <w:rFonts w:ascii="Wingdings" w:hAnsi="Wingdings" w:hint="default"/>
+        <w:sz w:val="20"/>
+      </w:rPr>
+    </w:lvl>
+    <w:lvl w:ilvl="4" w:tentative="1">
+      <w:start w:val="1"/>
+      <w:numFmt w:val="bullet"/>
+      <w:lvlText w:val=""/>
+      <w:lvlJc w:val="left"/>
+      <w:pPr>
+        <w:tabs>
+          <w:tab w:val="num" w:pos="3600"/>
+        </w:tabs>
+        <w:ind w:left="3600" w:hanging="360"/>
+      </w:pPr>
+      <w:rPr>
+        <w:rFonts w:ascii="Wingdings" w:hAnsi="Wingdings" w:hint="default"/>
+        <w:sz w:val="20"/>
+      </w:rPr>
+    </w:lvl>
+    <w:lvl w:ilvl="5" w:tentative="1">
+      <w:start w:val="1"/>
+      <w:numFmt w:val="bullet"/>
+      <w:lvlText w:val=""/>
+      <w:lvlJc w:val="left"/>
+      <w:pPr>
+        <w:tabs>
+          <w:tab w:val="num" w:pos="4320"/>
+        </w:tabs>
+        <w:ind w:left="4320" w:hanging="360"/>
+      </w:pPr>
+      <w:rPr>
+        <w:rFonts w:ascii="Wingdings" w:hAnsi="Wingdings" w:hint="default"/>
+        <w:sz w:val="20"/>
+      </w:rPr>
+    </w:lvl>
+    <w:lvl w:ilvl="6" w:tentative="1">
+      <w:start w:val="1"/>
+      <w:numFmt w:val="bullet"/>
+      <w:lvlText w:val=""/>
+      <w:lvlJc w:val="left"/>
+      <w:pPr>
+        <w:tabs>
+          <w:tab w:val="num" w:pos="5040"/>
+        </w:tabs>
+        <w:ind w:left="5040" w:hanging="360"/>
+      </w:pPr>
+      <w:rPr>
+        <w:rFonts w:ascii="Wingdings" w:hAnsi="Wingdings" w:hint="default"/>
+        <w:sz w:val="20"/>
+      </w:rPr>
+    </w:lvl>
+    <w:lvl w:ilvl="7" w:tentative="1">
+      <w:start w:val="1"/>
+      <w:numFmt w:val="bullet"/>
+      <w:lvlText w:val=""/>
+      <w:lvlJc w:val="left"/>
+      <w:pPr>
+        <w:tabs>
+          <w:tab w:val="num" w:pos="5760"/>
+        </w:tabs>
+        <w:ind w:left="5760" w:hanging="360"/>
+      </w:pPr>
+      <w:rPr>
+        <w:rFonts w:ascii="Wingdings" w:hAnsi="Wingdings" w:hint="default"/>
+        <w:sz w:val="20"/>
+      </w:rPr>
+    </w:lvl>
+    <w:lvl w:ilvl="8" w:tentative="1">
+      <w:start w:val="1"/>
+      <w:numFmt w:val="bullet"/>
+      <w:lvlText w:val=""/>
+      <w:lvlJc w:val="left"/>
+      <w:pPr>
+        <w:tabs>
+          <w:tab w:val="num" w:pos="6480"/>
+        </w:tabs>
+        <w:ind w:left="6480" w:hanging="360"/>
+      </w:pPr>
+      <w:rPr>
+        <w:rFonts w:ascii="Wingdings" w:hAnsi="Wingdings" w:hint="default"/>
+        <w:sz w:val="20"/>
+      </w:rPr>
+    </w:lvl>
+  </w:abstractNum>
+  <w:abstractNum w:abstractNumId="5" w15:restartNumberingAfterBreak="0">
+    <w:nsid w:val="5B1F029C"/>
+    <w:multiLevelType w:val="multilevel"/>
+    <w:tmpl w:val="8D14A4E4"/>
+    <w:lvl w:ilvl="0">
+      <w:start w:val="1"/>
+      <w:numFmt w:val="bullet"/>
+      <w:lvlText w:val=""/>
+      <w:lvlJc w:val="left"/>
+      <w:pPr>
+        <w:tabs>
+          <w:tab w:val="num" w:pos="720"/>
+        </w:tabs>
+        <w:ind w:left="720" w:hanging="360"/>
+      </w:pPr>
+      <w:rPr>
+        <w:rFonts w:ascii="Symbol" w:hAnsi="Symbol" w:hint="default"/>
+        <w:sz w:val="20"/>
+      </w:rPr>
+    </w:lvl>
+    <w:lvl w:ilvl="1" w:tentative="1">
+      <w:start w:val="1"/>
+      <w:numFmt w:val="bullet"/>
+      <w:lvlText w:val="o"/>
+      <w:lvlJc w:val="left"/>
+      <w:pPr>
+        <w:tabs>
+          <w:tab w:val="num" w:pos="1440"/>
+        </w:tabs>
+        <w:ind w:left="1440" w:hanging="360"/>
+      </w:pPr>
+      <w:rPr>
+        <w:rFonts w:ascii="Courier New" w:hAnsi="Courier New" w:hint="default"/>
+        <w:sz w:val="20"/>
+      </w:rPr>
+    </w:lvl>
+    <w:lvl w:ilvl="2" w:tentative="1">
+      <w:start w:val="1"/>
+      <w:numFmt w:val="bullet"/>
+      <w:lvlText w:val=""/>
+      <w:lvlJc w:val="left"/>
+      <w:pPr>
+        <w:tabs>
+          <w:tab w:val="num" w:pos="2160"/>
+        </w:tabs>
+        <w:ind w:left="2160" w:hanging="360"/>
+      </w:pPr>
+      <w:rPr>
+        <w:rFonts w:ascii="Wingdings" w:hAnsi="Wingdings" w:hint="default"/>
+        <w:sz w:val="20"/>
+      </w:rPr>
+    </w:lvl>
+    <w:lvl w:ilvl="3" w:tentative="1">
+      <w:start w:val="1"/>
+      <w:numFmt w:val="bullet"/>
+      <w:lvlText w:val=""/>
+      <w:lvlJc w:val="left"/>
+      <w:pPr>
+        <w:tabs>
+          <w:tab w:val="num" w:pos="2880"/>
+        </w:tabs>
+        <w:ind w:left="2880" w:hanging="360"/>
+      </w:pPr>
+      <w:rPr>
+        <w:rFonts w:ascii="Wingdings" w:hAnsi="Wingdings" w:hint="default"/>
+        <w:sz w:val="20"/>
+      </w:rPr>
+    </w:lvl>
+    <w:lvl w:ilvl="4" w:tentative="1">
+      <w:start w:val="1"/>
+      <w:numFmt w:val="bullet"/>
+      <w:lvlText w:val=""/>
+      <w:lvlJc w:val="left"/>
+      <w:pPr>
+        <w:tabs>
+          <w:tab w:val="num" w:pos="3600"/>
+        </w:tabs>
+        <w:ind w:left="3600" w:hanging="360"/>
+      </w:pPr>
+      <w:rPr>
+        <w:rFonts w:ascii="Wingdings" w:hAnsi="Wingdings" w:hint="default"/>
+        <w:sz w:val="20"/>
+      </w:rPr>
+    </w:lvl>
+    <w:lvl w:ilvl="5" w:tentative="1">
+      <w:start w:val="1"/>
+      <w:numFmt w:val="bullet"/>
+      <w:lvlText w:val=""/>
+      <w:lvlJc w:val="left"/>
+      <w:pPr>
+        <w:tabs>
+          <w:tab w:val="num" w:pos="4320"/>
+        </w:tabs>
+        <w:ind w:left="4320" w:hanging="360"/>
+      </w:pPr>
+      <w:rPr>
+        <w:rFonts w:ascii="Wingdings" w:hAnsi="Wingdings" w:hint="default"/>
+        <w:sz w:val="20"/>
+      </w:rPr>
+    </w:lvl>
+    <w:lvl w:ilvl="6" w:tentative="1">
+      <w:start w:val="1"/>
+      <w:numFmt w:val="bullet"/>
+      <w:lvlText w:val=""/>
+      <w:lvlJc w:val="left"/>
+      <w:pPr>
+        <w:tabs>
+          <w:tab w:val="num" w:pos="5040"/>
+        </w:tabs>
+        <w:ind w:left="5040" w:hanging="360"/>
+      </w:pPr>
+      <w:rPr>
+        <w:rFonts w:ascii="Wingdings" w:hAnsi="Wingdings" w:hint="default"/>
+        <w:sz w:val="20"/>
+      </w:rPr>
+    </w:lvl>
+    <w:lvl w:ilvl="7" w:tentative="1">
+      <w:start w:val="1"/>
+      <w:numFmt w:val="bullet"/>
+      <w:lvlText w:val=""/>
+      <w:lvlJc w:val="left"/>
+      <w:pPr>
+        <w:tabs>
+          <w:tab w:val="num" w:pos="5760"/>
+        </w:tabs>
+        <w:ind w:left="5760" w:hanging="360"/>
+      </w:pPr>
+      <w:rPr>
+        <w:rFonts w:ascii="Wingdings" w:hAnsi="Wingdings" w:hint="default"/>
+        <w:sz w:val="20"/>
+      </w:rPr>
+    </w:lvl>
+    <w:lvl w:ilvl="8" w:tentative="1">
+      <w:start w:val="1"/>
+      <w:numFmt w:val="bullet"/>
+      <w:lvlText w:val=""/>
+      <w:lvlJc w:val="left"/>
+      <w:pPr>
+        <w:tabs>
+          <w:tab w:val="num" w:pos="6480"/>
+        </w:tabs>
+        <w:ind w:left="6480" w:hanging="360"/>
+      </w:pPr>
+      <w:rPr>
+        <w:rFonts w:ascii="Wingdings" w:hAnsi="Wingdings" w:hint="default"/>
+        <w:sz w:val="20"/>
+      </w:rPr>
+    </w:lvl>
+  </w:abstractNum>
+  <w:abstractNum w:abstractNumId="6" w15:restartNumberingAfterBreak="0">
+    <w:nsid w:val="61D14DF9"/>
+    <w:multiLevelType w:val="multilevel"/>
+    <w:tmpl w:val="0420C162"/>
+    <w:lvl w:ilvl="0">
+      <w:start w:val="1"/>
+      <w:numFmt w:val="bullet"/>
+      <w:lvlText w:val=""/>
+      <w:lvlJc w:val="left"/>
+      <w:pPr>
+        <w:tabs>
+          <w:tab w:val="num" w:pos="720"/>
+        </w:tabs>
+        <w:ind w:left="720" w:hanging="360"/>
+      </w:pPr>
+      <w:rPr>
+        <w:rFonts w:ascii="Symbol" w:hAnsi="Symbol" w:hint="default"/>
+        <w:sz w:val="20"/>
+      </w:rPr>
+    </w:lvl>
+    <w:lvl w:ilvl="1" w:tentative="1">
+      <w:start w:val="1"/>
+      <w:numFmt w:val="bullet"/>
+      <w:lvlText w:val="o"/>
+      <w:lvlJc w:val="left"/>
+      <w:pPr>
+        <w:tabs>
+          <w:tab w:val="num" w:pos="1440"/>
+        </w:tabs>
+        <w:ind w:left="1440" w:hanging="360"/>
+      </w:pPr>
+      <w:rPr>
+        <w:rFonts w:ascii="Courier New" w:hAnsi="Courier New" w:hint="default"/>
+        <w:sz w:val="20"/>
+      </w:rPr>
+    </w:lvl>
+    <w:lvl w:ilvl="2" w:tentative="1">
+      <w:start w:val="1"/>
+      <w:numFmt w:val="bullet"/>
+      <w:lvlText w:val=""/>
+      <w:lvlJc w:val="left"/>
+      <w:pPr>
+        <w:tabs>
+          <w:tab w:val="num" w:pos="2160"/>
+        </w:tabs>
+        <w:ind w:left="2160" w:hanging="360"/>
+      </w:pPr>
+      <w:rPr>
+        <w:rFonts w:ascii="Wingdings" w:hAnsi="Wingdings" w:hint="default"/>
+        <w:sz w:val="20"/>
+      </w:rPr>
+    </w:lvl>
+    <w:lvl w:ilvl="3" w:tentative="1">
+      <w:start w:val="1"/>
+      <w:numFmt w:val="bullet"/>
+      <w:lvlText w:val=""/>
+      <w:lvlJc w:val="left"/>
+      <w:pPr>
+        <w:tabs>
+          <w:tab w:val="num" w:pos="2880"/>
+        </w:tabs>
+        <w:ind w:left="2880" w:hanging="360"/>
+      </w:pPr>
+      <w:rPr>
+        <w:rFonts w:ascii="Wingdings" w:hAnsi="Wingdings" w:hint="default"/>
+        <w:sz w:val="20"/>
+      </w:rPr>
+    </w:lvl>
+    <w:lvl w:ilvl="4" w:tentative="1">
+      <w:start w:val="1"/>
+      <w:numFmt w:val="bullet"/>
+      <w:lvlText w:val=""/>
+      <w:lvlJc w:val="left"/>
+      <w:pPr>
+        <w:tabs>
+          <w:tab w:val="num" w:pos="3600"/>
+        </w:tabs>
+        <w:ind w:left="3600" w:hanging="360"/>
+      </w:pPr>
+      <w:rPr>
+        <w:rFonts w:ascii="Wingdings" w:hAnsi="Wingdings" w:hint="default"/>
+        <w:sz w:val="20"/>
+      </w:rPr>
+    </w:lvl>
+    <w:lvl w:ilvl="5" w:tentative="1">
+      <w:start w:val="1"/>
+      <w:numFmt w:val="bullet"/>
+      <w:lvlText w:val=""/>
+      <w:lvlJc w:val="left"/>
+      <w:pPr>
+        <w:tabs>
+          <w:tab w:val="num" w:pos="4320"/>
+        </w:tabs>
+        <w:ind w:left="4320" w:hanging="360"/>
+      </w:pPr>
+      <w:rPr>
+        <w:rFonts w:ascii="Wingdings" w:hAnsi="Wingdings" w:hint="default"/>
+        <w:sz w:val="20"/>
+      </w:rPr>
+    </w:lvl>
+    <w:lvl w:ilvl="6" w:tentative="1">
+      <w:start w:val="1"/>
+      <w:numFmt w:val="bullet"/>
+      <w:lvlText w:val=""/>
+      <w:lvlJc w:val="left"/>
+      <w:pPr>
+        <w:tabs>
+          <w:tab w:val="num" w:pos="5040"/>
+        </w:tabs>
+        <w:ind w:left="5040" w:hanging="360"/>
+      </w:pPr>
+      <w:rPr>
+        <w:rFonts w:ascii="Wingdings" w:hAnsi="Wingdings" w:hint="default"/>
+        <w:sz w:val="20"/>
+      </w:rPr>
+    </w:lvl>
+    <w:lvl w:ilvl="7" w:tentative="1">
+      <w:start w:val="1"/>
+      <w:numFmt w:val="bullet"/>
+      <w:lvlText w:val=""/>
+      <w:lvlJc w:val="left"/>
+      <w:pPr>
+        <w:tabs>
+          <w:tab w:val="num" w:pos="5760"/>
+        </w:tabs>
+        <w:ind w:left="5760" w:hanging="360"/>
+      </w:pPr>
+      <w:rPr>
+        <w:rFonts w:ascii="Wingdings" w:hAnsi="Wingdings" w:hint="default"/>
+        <w:sz w:val="20"/>
+      </w:rPr>
+    </w:lvl>
+    <w:lvl w:ilvl="8" w:tentative="1">
+      <w:start w:val="1"/>
+      <w:numFmt w:val="bullet"/>
+      <w:lvlText w:val=""/>
+      <w:lvlJc w:val="left"/>
+      <w:pPr>
+        <w:tabs>
+          <w:tab w:val="num" w:pos="6480"/>
+        </w:tabs>
+        <w:ind w:left="6480" w:hanging="360"/>
+      </w:pPr>
+      <w:rPr>
+        <w:rFonts w:ascii="Wingdings" w:hAnsi="Wingdings" w:hint="default"/>
+        <w:sz w:val="20"/>
+      </w:rPr>
+    </w:lvl>
+  </w:abstractNum>
+  <w:abstractNum w:abstractNumId="7" w15:restartNumberingAfterBreak="0">
+    <w:nsid w:val="6A7C5C72"/>
+    <w:multiLevelType w:val="multilevel"/>
+    <w:tmpl w:val="AF304272"/>
+    <w:lvl w:ilvl="0">
+      <w:start w:val="1"/>
+      <w:numFmt w:val="bullet"/>
+      <w:lvlText w:val=""/>
+      <w:lvlJc w:val="left"/>
+      <w:pPr>
+        <w:tabs>
+          <w:tab w:val="num" w:pos="720"/>
+        </w:tabs>
+        <w:ind w:left="720" w:hanging="360"/>
+      </w:pPr>
+      <w:rPr>
+        <w:rFonts w:ascii="Symbol" w:hAnsi="Symbol" w:hint="default"/>
+        <w:sz w:val="20"/>
+      </w:rPr>
+    </w:lvl>
+    <w:lvl w:ilvl="1">
+      <w:start w:val="1"/>
+      <w:numFmt w:val="bullet"/>
+      <w:lvlText w:val="o"/>
+      <w:lvlJc w:val="left"/>
+      <w:pPr>
+        <w:tabs>
+          <w:tab w:val="num" w:pos="1440"/>
+        </w:tabs>
+        <w:ind w:left="1440" w:hanging="360"/>
+      </w:pPr>
+      <w:rPr>
+        <w:rFonts w:ascii="Courier New" w:hAnsi="Courier New" w:hint="default"/>
+        <w:sz w:val="20"/>
+      </w:rPr>
+    </w:lvl>
+    <w:lvl w:ilvl="2" w:tentative="1">
+      <w:start w:val="1"/>
+      <w:numFmt w:val="bullet"/>
+      <w:lvlText w:val=""/>
+      <w:lvlJc w:val="left"/>
+      <w:pPr>
+        <w:tabs>
+          <w:tab w:val="num" w:pos="2160"/>
+        </w:tabs>
+        <w:ind w:left="2160" w:hanging="360"/>
+      </w:pPr>
+      <w:rPr>
+        <w:rFonts w:ascii="Wingdings" w:hAnsi="Wingdings" w:hint="default"/>
+        <w:sz w:val="20"/>
+      </w:rPr>
+    </w:lvl>
+    <w:lvl w:ilvl="3" w:tentative="1">
+      <w:start w:val="1"/>
+      <w:numFmt w:val="bullet"/>
+      <w:lvlText w:val=""/>
+      <w:lvlJc w:val="left"/>
+      <w:pPr>
+        <w:tabs>
+          <w:tab w:val="num" w:pos="2880"/>
+        </w:tabs>
+        <w:ind w:left="2880" w:hanging="360"/>
+      </w:pPr>
+      <w:rPr>
+        <w:rFonts w:ascii="Wingdings" w:hAnsi="Wingdings" w:hint="default"/>
+        <w:sz w:val="20"/>
+      </w:rPr>
+    </w:lvl>
+    <w:lvl w:ilvl="4" w:tentative="1">
+      <w:start w:val="1"/>
+      <w:numFmt w:val="bullet"/>
+      <w:lvlText w:val=""/>
+      <w:lvlJc w:val="left"/>
+      <w:pPr>
+        <w:tabs>
+          <w:tab w:val="num" w:pos="3600"/>
+        </w:tabs>
+        <w:ind w:left="3600" w:hanging="360"/>
+      </w:pPr>
+      <w:rPr>
+        <w:rFonts w:ascii="Wingdings" w:hAnsi="Wingdings" w:hint="default"/>
+        <w:sz w:val="20"/>
+      </w:rPr>
+    </w:lvl>
+    <w:lvl w:ilvl="5" w:tentative="1">
+      <w:start w:val="1"/>
+      <w:numFmt w:val="bullet"/>
+      <w:lvlText w:val=""/>
+      <w:lvlJc w:val="left"/>
+      <w:pPr>
+        <w:tabs>
+          <w:tab w:val="num" w:pos="4320"/>
+        </w:tabs>
+        <w:ind w:left="4320" w:hanging="360"/>
+      </w:pPr>
+      <w:rPr>
+        <w:rFonts w:ascii="Wingdings" w:hAnsi="Wingdings" w:hint="default"/>
+        <w:sz w:val="20"/>
+      </w:rPr>
+    </w:lvl>
+    <w:lvl w:ilvl="6" w:tentative="1">
+      <w:start w:val="1"/>
+      <w:numFmt w:val="bullet"/>
+      <w:lvlText w:val=""/>
+      <w:lvlJc w:val="left"/>
+      <w:pPr>
+        <w:tabs>
+          <w:tab w:val="num" w:pos="5040"/>
+        </w:tabs>
+        <w:ind w:left="5040" w:hanging="360"/>
+      </w:pPr>
+      <w:rPr>
+        <w:rFonts w:ascii="Wingdings" w:hAnsi="Wingdings" w:hint="default"/>
+        <w:sz w:val="20"/>
+      </w:rPr>
+    </w:lvl>
+    <w:lvl w:ilvl="7" w:tentative="1">
+      <w:start w:val="1"/>
+      <w:numFmt w:val="bullet"/>
+      <w:lvlText w:val=""/>
+      <w:lvlJc w:val="left"/>
+      <w:pPr>
+        <w:tabs>
+          <w:tab w:val="num" w:pos="5760"/>
+        </w:tabs>
+        <w:ind w:left="5760" w:hanging="360"/>
+      </w:pPr>
+      <w:rPr>
+        <w:rFonts w:ascii="Wingdings" w:hAnsi="Wingdings" w:hint="default"/>
+        <w:sz w:val="20"/>
+      </w:rPr>
+    </w:lvl>
+    <w:lvl w:ilvl="8" w:tentative="1">
+      <w:start w:val="1"/>
+      <w:numFmt w:val="bullet"/>
+      <w:lvlText w:val=""/>
+      <w:lvlJc w:val="left"/>
+      <w:pPr>
+        <w:tabs>
+          <w:tab w:val="num" w:pos="6480"/>
+        </w:tabs>
+        <w:ind w:left="6480" w:hanging="360"/>
+      </w:pPr>
+      <w:rPr>
+        <w:rFonts w:ascii="Wingdings" w:hAnsi="Wingdings" w:hint="default"/>
+        <w:sz w:val="20"/>
+      </w:rPr>
+    </w:lvl>
+  </w:abstractNum>
+  <w:abstractNum w:abstractNumId="8" w15:restartNumberingAfterBreak="0">
+    <w:nsid w:val="6E3D6F7F"/>
+    <w:multiLevelType w:val="multilevel"/>
+    <w:tmpl w:val="41247BB2"/>
+    <w:lvl w:ilvl="0">
+      <w:start w:val="1"/>
+      <w:numFmt w:val="bullet"/>
+      <w:lvlText w:val=""/>
+      <w:lvlJc w:val="left"/>
+      <w:pPr>
+        <w:tabs>
+          <w:tab w:val="num" w:pos="720"/>
+        </w:tabs>
+        <w:ind w:left="720" w:hanging="360"/>
+      </w:pPr>
+      <w:rPr>
+        <w:rFonts w:ascii="Symbol" w:hAnsi="Symbol" w:hint="default"/>
+        <w:sz w:val="20"/>
+      </w:rPr>
+    </w:lvl>
+    <w:lvl w:ilvl="1" w:tentative="1">
+      <w:start w:val="1"/>
+      <w:numFmt w:val="bullet"/>
+      <w:lvlText w:val="o"/>
+      <w:lvlJc w:val="left"/>
+      <w:pPr>
+        <w:tabs>
+          <w:tab w:val="num" w:pos="1440"/>
+        </w:tabs>
+        <w:ind w:left="1440" w:hanging="360"/>
+      </w:pPr>
+      <w:rPr>
+        <w:rFonts w:ascii="Courier New" w:hAnsi="Courier New" w:hint="default"/>
+        <w:sz w:val="20"/>
+      </w:rPr>
+    </w:lvl>
+    <w:lvl w:ilvl="2" w:tentative="1">
+      <w:start w:val="1"/>
+      <w:numFmt w:val="bullet"/>
+      <w:lvlText w:val=""/>
+      <w:lvlJc w:val="left"/>
+      <w:pPr>
+        <w:tabs>
+          <w:tab w:val="num" w:pos="2160"/>
+        </w:tabs>
+        <w:ind w:left="2160" w:hanging="360"/>
+      </w:pPr>
+      <w:rPr>
+        <w:rFonts w:ascii="Wingdings" w:hAnsi="Wingdings" w:hint="default"/>
+        <w:sz w:val="20"/>
+      </w:rPr>
+    </w:lvl>
+    <w:lvl w:ilvl="3" w:tentative="1">
+      <w:start w:val="1"/>
+      <w:numFmt w:val="bullet"/>
+      <w:lvlText w:val=""/>
+      <w:lvlJc w:val="left"/>
+      <w:pPr>
+        <w:tabs>
+          <w:tab w:val="num" w:pos="2880"/>
+        </w:tabs>
+        <w:ind w:left="2880" w:hanging="360"/>
+      </w:pPr>
+      <w:rPr>
+        <w:rFonts w:ascii="Wingdings" w:hAnsi="Wingdings" w:hint="default"/>
+        <w:sz w:val="20"/>
+      </w:rPr>
+    </w:lvl>
+    <w:lvl w:ilvl="4" w:tentative="1">
+      <w:start w:val="1"/>
+      <w:numFmt w:val="bullet"/>
+      <w:lvlText w:val=""/>
+      <w:lvlJc w:val="left"/>
+      <w:pPr>
+        <w:tabs>
+          <w:tab w:val="num" w:pos="3600"/>
+        </w:tabs>
+        <w:ind w:left="3600" w:hanging="360"/>
+      </w:pPr>
+      <w:rPr>
+        <w:rFonts w:ascii="Wingdings" w:hAnsi="Wingdings" w:hint="default"/>
+        <w:sz w:val="20"/>
+      </w:rPr>
+    </w:lvl>
+    <w:lvl w:ilvl="5" w:tentative="1">
+      <w:start w:val="1"/>
+      <w:numFmt w:val="bullet"/>
+      <w:lvlText w:val=""/>
+      <w:lvlJc w:val="left"/>
+      <w:pPr>
+        <w:tabs>
+          <w:tab w:val="num" w:pos="4320"/>
+        </w:tabs>
+        <w:ind w:left="4320" w:hanging="360"/>
+      </w:pPr>
+      <w:rPr>
+        <w:rFonts w:ascii="Wingdings" w:hAnsi="Wingdings" w:hint="default"/>
+        <w:sz w:val="20"/>
+      </w:rPr>
+    </w:lvl>
+    <w:lvl w:ilvl="6" w:tentative="1">
+      <w:start w:val="1"/>
+      <w:numFmt w:val="bullet"/>
+      <w:lvlText w:val=""/>
+      <w:lvlJc w:val="left"/>
+      <w:pPr>
+        <w:tabs>
+          <w:tab w:val="num" w:pos="5040"/>
+        </w:tabs>
+        <w:ind w:left="5040" w:hanging="360"/>
+      </w:pPr>
+      <w:rPr>
+        <w:rFonts w:ascii="Wingdings" w:hAnsi="Wingdings" w:hint="default"/>
+        <w:sz w:val="20"/>
+      </w:rPr>
+    </w:lvl>
+    <w:lvl w:ilvl="7" w:tentative="1">
+      <w:start w:val="1"/>
+      <w:numFmt w:val="bullet"/>
+      <w:lvlText w:val=""/>
+      <w:lvlJc w:val="left"/>
+      <w:pPr>
+        <w:tabs>
+          <w:tab w:val="num" w:pos="5760"/>
+        </w:tabs>
+        <w:ind w:left="5760" w:hanging="360"/>
+      </w:pPr>
+      <w:rPr>
+        <w:rFonts w:ascii="Wingdings" w:hAnsi="Wingdings" w:hint="default"/>
+        <w:sz w:val="20"/>
+      </w:rPr>
+    </w:lvl>
+    <w:lvl w:ilvl="8" w:tentative="1">
+      <w:start w:val="1"/>
+      <w:numFmt w:val="bullet"/>
+      <w:lvlText w:val=""/>
+      <w:lvlJc w:val="left"/>
+      <w:pPr>
+        <w:tabs>
+          <w:tab w:val="num" w:pos="6480"/>
+        </w:tabs>
+        <w:ind w:left="6480" w:hanging="360"/>
+      </w:pPr>
+      <w:rPr>
+        <w:rFonts w:ascii="Wingdings" w:hAnsi="Wingdings" w:hint="default"/>
+        <w:sz w:val="20"/>
+      </w:rPr>
+    </w:lvl>
+  </w:abstractNum>
   <w:num w:numId="1" w16cid:durableId="1037240408">
+    <w:abstractNumId w:val="2"/>
+  </w:num>
+  <w:num w:numId="2" w16cid:durableId="927039420">
+    <w:abstractNumId w:val="6"/>
+  </w:num>
+  <w:num w:numId="3" w16cid:durableId="1245065221">
+    <w:abstractNumId w:val="3"/>
+  </w:num>
+  <w:num w:numId="4" w16cid:durableId="374626781">
+    <w:abstractNumId w:val="5"/>
+  </w:num>
+  <w:num w:numId="5" w16cid:durableId="2087341555">
+    <w:abstractNumId w:val="4"/>
+  </w:num>
+  <w:num w:numId="6" w16cid:durableId="1052382585">
+    <w:abstractNumId w:val="7"/>
+  </w:num>
+  <w:num w:numId="7" w16cid:durableId="2056193097">
+    <w:abstractNumId w:val="8"/>
+  </w:num>
+  <w:num w:numId="8" w16cid:durableId="477921141">
+    <w:abstractNumId w:val="1"/>
+  </w:num>
+  <w:num w:numId="9" w16cid:durableId="1680540297">
     <w:abstractNumId w:val="0"/>
   </w:num>
 </w:numbering>
@@ -862,7 +2784,6 @@
   <w:style w:type="character" w:default="1" w:styleId="Standaardalinea-lettertype">
     <w:name w:val="Default Paragraph Font"/>
     <w:uiPriority w:val="1"/>
-    <w:semiHidden/>
     <w:unhideWhenUsed/>
   </w:style>
   <w:style w:type="table" w:default="1" w:styleId="Standaardtabel">

</xml_diff>

<commit_message>
Testomegeving toegevoegd + GameMoeilijker gemaakt
</commit_message>
<xml_diff>
--- a/Docs/Logboek.docx
+++ b/Docs/Logboek.docx
@@ -826,6 +826,535 @@
           <w:lang w:val="nl-NL"/>
         </w:rPr>
         <w:t>De game moeilijker maken naarmate de speler langer overleeft.</w:t>
+      </w:r>
+    </w:p>
+    <w:p>
+      <w:pPr>
+        <w:rPr>
+          <w:lang w:val="nl-NL"/>
+        </w:rPr>
+      </w:pPr>
+    </w:p>
+    <w:p>
+      <w:pPr>
+        <w:rPr>
+          <w:b/>
+          <w:bCs/>
+        </w:rPr>
+      </w:pPr>
+      <w:r>
+        <w:rPr>
+          <w:b/>
+          <w:bCs/>
+        </w:rPr>
+        <w:t>Dag 3</w:t>
+      </w:r>
+    </w:p>
+    <w:p>
+      <w:pPr>
+        <w:rPr>
+          <w:b/>
+          <w:bCs/>
+        </w:rPr>
+      </w:pPr>
+      <w:r>
+        <w:rPr>
+          <w:b/>
+          <w:bCs/>
+        </w:rPr>
+        <w:t>Wat ik vandaag heb gedaan</w:t>
+      </w:r>
+    </w:p>
+    <w:p>
+      <w:pPr>
+        <w:numPr>
+          <w:ilvl w:val="0"/>
+          <w:numId w:val="10"/>
+        </w:numPr>
+      </w:pPr>
+      <w:r>
+        <w:t xml:space="preserve">Verder gewerkt aan de gameplay van de game. </w:t>
+      </w:r>
+    </w:p>
+    <w:p>
+      <w:pPr>
+        <w:numPr>
+          <w:ilvl w:val="0"/>
+          <w:numId w:val="10"/>
+        </w:numPr>
+      </w:pPr>
+      <w:r>
+        <w:t xml:space="preserve">De tijdelijke blokjes en cirkels vervangen door echte game assets. </w:t>
+      </w:r>
+    </w:p>
+    <w:p>
+      <w:pPr>
+        <w:numPr>
+          <w:ilvl w:val="0"/>
+          <w:numId w:val="10"/>
+        </w:numPr>
+      </w:pPr>
+      <w:r>
+        <w:t xml:space="preserve">Een ruimteschip asset toegevoegd als speler. </w:t>
+      </w:r>
+    </w:p>
+    <w:p>
+      <w:pPr>
+        <w:numPr>
+          <w:ilvl w:val="0"/>
+          <w:numId w:val="10"/>
+        </w:numPr>
+      </w:pPr>
+      <w:r>
+        <w:t xml:space="preserve">Asteroid assets toegevoegd als vijanden. </w:t>
+      </w:r>
+    </w:p>
+    <w:p>
+      <w:pPr>
+        <w:numPr>
+          <w:ilvl w:val="0"/>
+          <w:numId w:val="10"/>
+        </w:numPr>
+      </w:pPr>
+      <w:r>
+        <w:t xml:space="preserve">De achtergrond van de game vervangen door een ruimteachtergrond. </w:t>
+      </w:r>
+    </w:p>
+    <w:p>
+      <w:pPr>
+        <w:numPr>
+          <w:ilvl w:val="0"/>
+          <w:numId w:val="10"/>
+        </w:numPr>
+      </w:pPr>
+      <w:r>
+        <w:t xml:space="preserve">De rendering volgorde aangepast zodat de speler zichtbaar blijft voor de achtergrond. </w:t>
+      </w:r>
+    </w:p>
+    <w:p>
+      <w:pPr>
+        <w:numPr>
+          <w:ilvl w:val="0"/>
+          <w:numId w:val="10"/>
+        </w:numPr>
+      </w:pPr>
+      <w:r>
+        <w:t xml:space="preserve">De collision tussen de speler en de asteroids verder getest. </w:t>
+      </w:r>
+    </w:p>
+    <w:p>
+      <w:pPr>
+        <w:numPr>
+          <w:ilvl w:val="0"/>
+          <w:numId w:val="10"/>
+        </w:numPr>
+      </w:pPr>
+      <w:r>
+        <w:t xml:space="preserve">De algemene uitstraling van de game verbeterd door het gebruik van echte graphics. </w:t>
+      </w:r>
+    </w:p>
+    <w:p>
+      <w:pPr>
+        <w:rPr>
+          <w:b/>
+          <w:bCs/>
+        </w:rPr>
+      </w:pPr>
+      <w:r>
+        <w:rPr>
+          <w:b/>
+          <w:bCs/>
+        </w:rPr>
+        <w:lastRenderedPageBreak/>
+        <w:t>Problemen / uitdagingen</w:t>
+      </w:r>
+    </w:p>
+    <w:p>
+      <w:pPr>
+        <w:numPr>
+          <w:ilvl w:val="0"/>
+          <w:numId w:val="11"/>
+        </w:numPr>
+      </w:pPr>
+      <w:r>
+        <w:t xml:space="preserve">De speler werd in eerste instantie achter de achtergrond weergegeven. </w:t>
+      </w:r>
+    </w:p>
+    <w:p>
+      <w:pPr>
+        <w:numPr>
+          <w:ilvl w:val="0"/>
+          <w:numId w:val="11"/>
+        </w:numPr>
+      </w:pPr>
+      <w:r>
+        <w:t xml:space="preserve">Dit opgelost door de Order in Layer instellingen van de sprites aan te passen. </w:t>
+      </w:r>
+    </w:p>
+    <w:p>
+      <w:pPr>
+        <w:numPr>
+          <w:ilvl w:val="0"/>
+          <w:numId w:val="11"/>
+        </w:numPr>
+      </w:pPr>
+      <w:r>
+        <w:t xml:space="preserve">Sommige assets hadden een verkeerde schaal en moesten worden aangepast. </w:t>
+      </w:r>
+    </w:p>
+    <w:p>
+      <w:pPr>
+        <w:rPr>
+          <w:b/>
+          <w:bCs/>
+        </w:rPr>
+      </w:pPr>
+      <w:r>
+        <w:rPr>
+          <w:b/>
+          <w:bCs/>
+        </w:rPr>
+        <w:t>Wat ik heb geleerd</w:t>
+      </w:r>
+    </w:p>
+    <w:p>
+      <w:pPr>
+        <w:numPr>
+          <w:ilvl w:val="0"/>
+          <w:numId w:val="12"/>
+        </w:numPr>
+      </w:pPr>
+      <w:r>
+        <w:t xml:space="preserve">Hoe Sprite Renderers werken. </w:t>
+      </w:r>
+    </w:p>
+    <w:p>
+      <w:pPr>
+        <w:numPr>
+          <w:ilvl w:val="0"/>
+          <w:numId w:val="12"/>
+        </w:numPr>
+      </w:pPr>
+      <w:r>
+        <w:t xml:space="preserve">Hoe Order in Layer gebruikt wordt om objecten voor of achter elkaar weer te geven. </w:t>
+      </w:r>
+    </w:p>
+    <w:p>
+      <w:pPr>
+        <w:numPr>
+          <w:ilvl w:val="0"/>
+          <w:numId w:val="12"/>
+        </w:numPr>
+      </w:pPr>
+      <w:r>
+        <w:t xml:space="preserve">Hoe assets geïmporteerd en toegepast worden in Unity. </w:t>
+      </w:r>
+    </w:p>
+    <w:p>
+      <w:pPr>
+        <w:rPr>
+          <w:b/>
+          <w:bCs/>
+        </w:rPr>
+      </w:pPr>
+      <w:r>
+        <w:rPr>
+          <w:b/>
+          <w:bCs/>
+        </w:rPr>
+        <w:t>Wat ik morgen wil doen</w:t>
+      </w:r>
+    </w:p>
+    <w:p>
+      <w:pPr>
+        <w:numPr>
+          <w:ilvl w:val="0"/>
+          <w:numId w:val="13"/>
+        </w:numPr>
+      </w:pPr>
+      <w:r>
+        <w:t xml:space="preserve">Een health systeem toevoegen. </w:t>
+      </w:r>
+    </w:p>
+    <w:p>
+      <w:pPr>
+        <w:numPr>
+          <w:ilvl w:val="0"/>
+          <w:numId w:val="13"/>
+        </w:numPr>
+      </w:pPr>
+      <w:r>
+        <w:t xml:space="preserve">Een score systeem toevoegen. </w:t>
+      </w:r>
+    </w:p>
+    <w:p>
+      <w:pPr>
+        <w:numPr>
+          <w:ilvl w:val="0"/>
+          <w:numId w:val="13"/>
+        </w:numPr>
+      </w:pPr>
+      <w:r>
+        <w:t xml:space="preserve">De game verder testen en verbeteren. </w:t>
+      </w:r>
+    </w:p>
+    <w:p>
+      <w:r>
+        <w:pict w14:anchorId="75E199A6">
+          <v:rect id="_x0000_i1031" style="width:0;height:1.5pt" o:hralign="center" o:hrstd="t" o:hr="t" fillcolor="#a0a0a0" stroked="f"/>
+        </w:pict>
+      </w:r>
+    </w:p>
+    <w:p>
+      <w:pPr>
+        <w:rPr>
+          <w:b/>
+          <w:bCs/>
+        </w:rPr>
+      </w:pPr>
+      <w:r>
+        <w:rPr>
+          <w:b/>
+          <w:bCs/>
+        </w:rPr>
+        <w:t>Dag 4</w:t>
+      </w:r>
+    </w:p>
+    <w:p>
+      <w:pPr>
+        <w:rPr>
+          <w:b/>
+          <w:bCs/>
+        </w:rPr>
+      </w:pPr>
+      <w:r>
+        <w:rPr>
+          <w:b/>
+          <w:bCs/>
+        </w:rPr>
+        <w:t>Wat ik vandaag heb gedaan</w:t>
+      </w:r>
+    </w:p>
+    <w:p>
+      <w:pPr>
+        <w:numPr>
+          <w:ilvl w:val="0"/>
+          <w:numId w:val="14"/>
+        </w:numPr>
+      </w:pPr>
+      <w:r>
+        <w:t xml:space="preserve">Een health systeem toegevoegd aan de speler. </w:t>
+      </w:r>
+    </w:p>
+    <w:p>
+      <w:pPr>
+        <w:numPr>
+          <w:ilvl w:val="0"/>
+          <w:numId w:val="14"/>
+        </w:numPr>
+      </w:pPr>
+      <w:r>
+        <w:t xml:space="preserve">Elke botsing met een asteroid vermindert de health van de speler met 10 punten. </w:t>
+      </w:r>
+    </w:p>
+    <w:p>
+      <w:pPr>
+        <w:numPr>
+          <w:ilvl w:val="0"/>
+          <w:numId w:val="14"/>
+        </w:numPr>
+      </w:pPr>
+      <w:r>
+        <w:t xml:space="preserve">Een score systeem toegevoegd zodat de speler punten kan verdienen tijdens het spelen. </w:t>
+      </w:r>
+    </w:p>
+    <w:p>
+      <w:pPr>
+        <w:numPr>
+          <w:ilvl w:val="0"/>
+          <w:numId w:val="14"/>
+        </w:numPr>
+      </w:pPr>
+      <w:r>
+        <w:t xml:space="preserve">Het game over systeem aangepast zodat de game automatisch opnieuw start wanneer de health van de speler 0 bereikt. </w:t>
+      </w:r>
+    </w:p>
+    <w:p>
+      <w:pPr>
+        <w:numPr>
+          <w:ilvl w:val="0"/>
+          <w:numId w:val="14"/>
+        </w:numPr>
+      </w:pPr>
+      <w:r>
+        <w:t xml:space="preserve">De nieuwe systemen uitgebreid getest om te controleren of ze correct werken. </w:t>
+      </w:r>
+    </w:p>
+    <w:p>
+      <w:pPr>
+        <w:numPr>
+          <w:ilvl w:val="0"/>
+          <w:numId w:val="14"/>
+        </w:numPr>
+      </w:pPr>
+      <w:r>
+        <w:t xml:space="preserve">Verschillende bugs opgelost die tijdens het testen naar voren kwamen. </w:t>
+      </w:r>
+    </w:p>
+    <w:p>
+      <w:pPr>
+        <w:rPr>
+          <w:b/>
+          <w:bCs/>
+        </w:rPr>
+      </w:pPr>
+      <w:r>
+        <w:rPr>
+          <w:b/>
+          <w:bCs/>
+        </w:rPr>
+        <w:t>Problemen / uitdagingen</w:t>
+      </w:r>
+    </w:p>
+    <w:p>
+      <w:pPr>
+        <w:numPr>
+          <w:ilvl w:val="0"/>
+          <w:numId w:val="15"/>
+        </w:numPr>
+      </w:pPr>
+      <w:r>
+        <w:t xml:space="preserve">Het correct bijhouden van de health tijdens meerdere botsingen. </w:t>
+      </w:r>
+    </w:p>
+    <w:p>
+      <w:pPr>
+        <w:numPr>
+          <w:ilvl w:val="0"/>
+          <w:numId w:val="15"/>
+        </w:numPr>
+      </w:pPr>
+      <w:r>
+        <w:t xml:space="preserve">Het combineren van het health systeem met het bestaande game over systeem. </w:t>
+      </w:r>
+    </w:p>
+    <w:p>
+      <w:pPr>
+        <w:numPr>
+          <w:ilvl w:val="0"/>
+          <w:numId w:val="15"/>
+        </w:numPr>
+      </w:pPr>
+      <w:r>
+        <w:t xml:space="preserve">Testen of de score correct bleef oplopen tijdens het spelen. </w:t>
+      </w:r>
+    </w:p>
+    <w:p>
+      <w:pPr>
+        <w:rPr>
+          <w:b/>
+          <w:bCs/>
+        </w:rPr>
+      </w:pPr>
+      <w:r>
+        <w:rPr>
+          <w:b/>
+          <w:bCs/>
+        </w:rPr>
+        <w:lastRenderedPageBreak/>
+        <w:t>Wat ik heb geleerd</w:t>
+      </w:r>
+    </w:p>
+    <w:p>
+      <w:pPr>
+        <w:numPr>
+          <w:ilvl w:val="0"/>
+          <w:numId w:val="16"/>
+        </w:numPr>
+      </w:pPr>
+      <w:r>
+        <w:t xml:space="preserve">Hoe variabelen gebruikt worden om spelergegevens zoals health en score op te slaan. </w:t>
+      </w:r>
+    </w:p>
+    <w:p>
+      <w:pPr>
+        <w:numPr>
+          <w:ilvl w:val="0"/>
+          <w:numId w:val="16"/>
+        </w:numPr>
+      </w:pPr>
+      <w:r>
+        <w:t xml:space="preserve">Hoe verschillende scripts met elkaar samenwerken. </w:t>
+      </w:r>
+    </w:p>
+    <w:p>
+      <w:pPr>
+        <w:numPr>
+          <w:ilvl w:val="0"/>
+          <w:numId w:val="16"/>
+        </w:numPr>
+      </w:pPr>
+      <w:r>
+        <w:t xml:space="preserve">Hoe gameplay logica kan worden uitgebreid zonder bestaande functionaliteit te breken. </w:t>
+      </w:r>
+    </w:p>
+    <w:p>
+      <w:pPr>
+        <w:rPr>
+          <w:b/>
+          <w:bCs/>
+        </w:rPr>
+      </w:pPr>
+      <w:r>
+        <w:rPr>
+          <w:b/>
+          <w:bCs/>
+        </w:rPr>
+        <w:t>Wat ik morgen wil doen</w:t>
+      </w:r>
+    </w:p>
+    <w:p>
+      <w:pPr>
+        <w:numPr>
+          <w:ilvl w:val="0"/>
+          <w:numId w:val="17"/>
+        </w:numPr>
+      </w:pPr>
+      <w:r>
+        <w:t xml:space="preserve">Een startmenu maken. </w:t>
+      </w:r>
+    </w:p>
+    <w:p>
+      <w:pPr>
+        <w:numPr>
+          <w:ilvl w:val="0"/>
+          <w:numId w:val="17"/>
+        </w:numPr>
+      </w:pPr>
+      <w:r>
+        <w:t xml:space="preserve">Een highscore systeem toevoegen. </w:t>
+      </w:r>
+    </w:p>
+    <w:p>
+      <w:pPr>
+        <w:numPr>
+          <w:ilvl w:val="0"/>
+          <w:numId w:val="17"/>
+        </w:numPr>
+      </w:pPr>
+      <w:r>
+        <w:t xml:space="preserve">Het Best Education logo en de slogan verwerken in de game. </w:t>
+      </w:r>
+    </w:p>
+    <w:p>
+      <w:pPr>
+        <w:numPr>
+          <w:ilvl w:val="0"/>
+          <w:numId w:val="17"/>
+        </w:numPr>
+      </w:pPr>
+      <w:r>
+        <w:t>De game verder afwerken voor de eindtest.</w:t>
       </w:r>
     </w:p>
     <w:p>
@@ -848,6 +1377,304 @@
 <file path=word/numbering.xml><?xml version="1.0" encoding="utf-8"?>
 <w:numbering xmlns:wpc="http://schemas.microsoft.com/office/word/2010/wordprocessingCanvas" xmlns:cx="http://schemas.microsoft.com/office/drawing/2014/chartex" xmlns:cx1="http://schemas.microsoft.com/office/drawing/2015/9/8/chartex" xmlns:cx2="http://schemas.microsoft.com/office/drawing/2015/10/21/chartex" xmlns:cx3="http://schemas.microsoft.com/office/drawing/2016/5/9/chartex" xmlns:cx4="http://schemas.microsoft.com/office/drawing/2016/5/10/chartex" xmlns:cx5="http://schemas.microsoft.com/office/drawing/2016/5/11/chartex" xmlns:cx6="http://schemas.microsoft.com/office/drawing/2016/5/12/chartex" xmlns:cx7="http://schemas.microsoft.com/office/drawing/2016/5/13/chartex" xmlns:cx8="http://schemas.microsoft.com/office/drawing/2016/5/14/chartex" xmlns:mc="http://schemas.openxmlformats.org/markup-compatibility/2006" xmlns:aink="http://schemas.microsoft.com/office/drawing/2016/ink" xmlns:am3d="http://schemas.microsoft.com/office/drawing/2017/model3d" xmlns:o="urn:schemas-microsoft-com:office:office" xmlns:oel="http://schemas.microsoft.com/office/2019/extlst" xmlns:r="http://schemas.openxmlformats.org/officeDocument/2006/relationships" xmlns:m="http://schemas.openxmlformats.org/officeDocument/2006/math" xmlns:v="urn:schemas-microsoft-com:vml" xmlns:wp14="http://schemas.microsoft.com/office/word/2010/wordprocessingDrawing" xmlns:wp="http://schemas.openxmlformats.org/drawingml/2006/wordprocessingDrawing" xmlns:w10="urn:schemas-microsoft-com:office:word" xmlns:w="http://schemas.openxmlformats.org/wordprocessingml/2006/main" xmlns:w14="http://schemas.microsoft.com/office/word/2010/wordml" xmlns:w15="http://schemas.microsoft.com/office/word/2012/wordml" xmlns:w16cex="http://schemas.microsoft.com/office/word/2018/wordml/cex" xmlns:w16cid="http://schemas.microsoft.com/office/word/2016/wordml/cid" xmlns:w16="http://schemas.microsoft.com/office/word/2018/wordml" xmlns:w16du="http://schemas.microsoft.com/office/word/2023/wordml/word16du" xmlns:w16sdtdh="http://schemas.microsoft.com/office/word/2020/wordml/sdtdatahash" xmlns:w16sdtfl="http://schemas.microsoft.com/office/word/2024/wordml/sdtformatlock" xmlns:w16se="http://schemas.microsoft.com/office/word/2015/wordml/symex" xmlns:wpg="http://schemas.microsoft.com/office/word/2010/wordprocessingGroup" xmlns:wpi="http://schemas.microsoft.com/office/word/2010/wordprocessingInk" xmlns:wne="http://schemas.microsoft.com/office/word/2006/wordml" xmlns:wps="http://schemas.microsoft.com/office/word/2010/wordprocessingShape" mc:Ignorable="w14 w15 w16se w16cid w16 w16cex w16sdtdh w16sdtfl w16du wp14">
   <w:abstractNum w:abstractNumId="0" w15:restartNumberingAfterBreak="0">
+    <w:nsid w:val="0B46348C"/>
+    <w:multiLevelType w:val="multilevel"/>
+    <w:tmpl w:val="3B04654E"/>
+    <w:lvl w:ilvl="0">
+      <w:start w:val="1"/>
+      <w:numFmt w:val="bullet"/>
+      <w:lvlText w:val=""/>
+      <w:lvlJc w:val="left"/>
+      <w:pPr>
+        <w:tabs>
+          <w:tab w:val="num" w:pos="720"/>
+        </w:tabs>
+        <w:ind w:left="720" w:hanging="360"/>
+      </w:pPr>
+      <w:rPr>
+        <w:rFonts w:ascii="Symbol" w:hAnsi="Symbol" w:hint="default"/>
+        <w:sz w:val="20"/>
+      </w:rPr>
+    </w:lvl>
+    <w:lvl w:ilvl="1" w:tentative="1">
+      <w:start w:val="1"/>
+      <w:numFmt w:val="bullet"/>
+      <w:lvlText w:val="o"/>
+      <w:lvlJc w:val="left"/>
+      <w:pPr>
+        <w:tabs>
+          <w:tab w:val="num" w:pos="1440"/>
+        </w:tabs>
+        <w:ind w:left="1440" w:hanging="360"/>
+      </w:pPr>
+      <w:rPr>
+        <w:rFonts w:ascii="Courier New" w:hAnsi="Courier New" w:hint="default"/>
+        <w:sz w:val="20"/>
+      </w:rPr>
+    </w:lvl>
+    <w:lvl w:ilvl="2" w:tentative="1">
+      <w:start w:val="1"/>
+      <w:numFmt w:val="bullet"/>
+      <w:lvlText w:val=""/>
+      <w:lvlJc w:val="left"/>
+      <w:pPr>
+        <w:tabs>
+          <w:tab w:val="num" w:pos="2160"/>
+        </w:tabs>
+        <w:ind w:left="2160" w:hanging="360"/>
+      </w:pPr>
+      <w:rPr>
+        <w:rFonts w:ascii="Wingdings" w:hAnsi="Wingdings" w:hint="default"/>
+        <w:sz w:val="20"/>
+      </w:rPr>
+    </w:lvl>
+    <w:lvl w:ilvl="3" w:tentative="1">
+      <w:start w:val="1"/>
+      <w:numFmt w:val="bullet"/>
+      <w:lvlText w:val=""/>
+      <w:lvlJc w:val="left"/>
+      <w:pPr>
+        <w:tabs>
+          <w:tab w:val="num" w:pos="2880"/>
+        </w:tabs>
+        <w:ind w:left="2880" w:hanging="360"/>
+      </w:pPr>
+      <w:rPr>
+        <w:rFonts w:ascii="Wingdings" w:hAnsi="Wingdings" w:hint="default"/>
+        <w:sz w:val="20"/>
+      </w:rPr>
+    </w:lvl>
+    <w:lvl w:ilvl="4" w:tentative="1">
+      <w:start w:val="1"/>
+      <w:numFmt w:val="bullet"/>
+      <w:lvlText w:val=""/>
+      <w:lvlJc w:val="left"/>
+      <w:pPr>
+        <w:tabs>
+          <w:tab w:val="num" w:pos="3600"/>
+        </w:tabs>
+        <w:ind w:left="3600" w:hanging="360"/>
+      </w:pPr>
+      <w:rPr>
+        <w:rFonts w:ascii="Wingdings" w:hAnsi="Wingdings" w:hint="default"/>
+        <w:sz w:val="20"/>
+      </w:rPr>
+    </w:lvl>
+    <w:lvl w:ilvl="5" w:tentative="1">
+      <w:start w:val="1"/>
+      <w:numFmt w:val="bullet"/>
+      <w:lvlText w:val=""/>
+      <w:lvlJc w:val="left"/>
+      <w:pPr>
+        <w:tabs>
+          <w:tab w:val="num" w:pos="4320"/>
+        </w:tabs>
+        <w:ind w:left="4320" w:hanging="360"/>
+      </w:pPr>
+      <w:rPr>
+        <w:rFonts w:ascii="Wingdings" w:hAnsi="Wingdings" w:hint="default"/>
+        <w:sz w:val="20"/>
+      </w:rPr>
+    </w:lvl>
+    <w:lvl w:ilvl="6" w:tentative="1">
+      <w:start w:val="1"/>
+      <w:numFmt w:val="bullet"/>
+      <w:lvlText w:val=""/>
+      <w:lvlJc w:val="left"/>
+      <w:pPr>
+        <w:tabs>
+          <w:tab w:val="num" w:pos="5040"/>
+        </w:tabs>
+        <w:ind w:left="5040" w:hanging="360"/>
+      </w:pPr>
+      <w:rPr>
+        <w:rFonts w:ascii="Wingdings" w:hAnsi="Wingdings" w:hint="default"/>
+        <w:sz w:val="20"/>
+      </w:rPr>
+    </w:lvl>
+    <w:lvl w:ilvl="7" w:tentative="1">
+      <w:start w:val="1"/>
+      <w:numFmt w:val="bullet"/>
+      <w:lvlText w:val=""/>
+      <w:lvlJc w:val="left"/>
+      <w:pPr>
+        <w:tabs>
+          <w:tab w:val="num" w:pos="5760"/>
+        </w:tabs>
+        <w:ind w:left="5760" w:hanging="360"/>
+      </w:pPr>
+      <w:rPr>
+        <w:rFonts w:ascii="Wingdings" w:hAnsi="Wingdings" w:hint="default"/>
+        <w:sz w:val="20"/>
+      </w:rPr>
+    </w:lvl>
+    <w:lvl w:ilvl="8" w:tentative="1">
+      <w:start w:val="1"/>
+      <w:numFmt w:val="bullet"/>
+      <w:lvlText w:val=""/>
+      <w:lvlJc w:val="left"/>
+      <w:pPr>
+        <w:tabs>
+          <w:tab w:val="num" w:pos="6480"/>
+        </w:tabs>
+        <w:ind w:left="6480" w:hanging="360"/>
+      </w:pPr>
+      <w:rPr>
+        <w:rFonts w:ascii="Wingdings" w:hAnsi="Wingdings" w:hint="default"/>
+        <w:sz w:val="20"/>
+      </w:rPr>
+    </w:lvl>
+  </w:abstractNum>
+  <w:abstractNum w:abstractNumId="1" w15:restartNumberingAfterBreak="0">
+    <w:nsid w:val="0BF90441"/>
+    <w:multiLevelType w:val="multilevel"/>
+    <w:tmpl w:val="B33A60DE"/>
+    <w:lvl w:ilvl="0">
+      <w:start w:val="1"/>
+      <w:numFmt w:val="bullet"/>
+      <w:lvlText w:val=""/>
+      <w:lvlJc w:val="left"/>
+      <w:pPr>
+        <w:tabs>
+          <w:tab w:val="num" w:pos="720"/>
+        </w:tabs>
+        <w:ind w:left="720" w:hanging="360"/>
+      </w:pPr>
+      <w:rPr>
+        <w:rFonts w:ascii="Symbol" w:hAnsi="Symbol" w:hint="default"/>
+        <w:sz w:val="20"/>
+      </w:rPr>
+    </w:lvl>
+    <w:lvl w:ilvl="1" w:tentative="1">
+      <w:start w:val="1"/>
+      <w:numFmt w:val="bullet"/>
+      <w:lvlText w:val="o"/>
+      <w:lvlJc w:val="left"/>
+      <w:pPr>
+        <w:tabs>
+          <w:tab w:val="num" w:pos="1440"/>
+        </w:tabs>
+        <w:ind w:left="1440" w:hanging="360"/>
+      </w:pPr>
+      <w:rPr>
+        <w:rFonts w:ascii="Courier New" w:hAnsi="Courier New" w:hint="default"/>
+        <w:sz w:val="20"/>
+      </w:rPr>
+    </w:lvl>
+    <w:lvl w:ilvl="2" w:tentative="1">
+      <w:start w:val="1"/>
+      <w:numFmt w:val="bullet"/>
+      <w:lvlText w:val=""/>
+      <w:lvlJc w:val="left"/>
+      <w:pPr>
+        <w:tabs>
+          <w:tab w:val="num" w:pos="2160"/>
+        </w:tabs>
+        <w:ind w:left="2160" w:hanging="360"/>
+      </w:pPr>
+      <w:rPr>
+        <w:rFonts w:ascii="Wingdings" w:hAnsi="Wingdings" w:hint="default"/>
+        <w:sz w:val="20"/>
+      </w:rPr>
+    </w:lvl>
+    <w:lvl w:ilvl="3" w:tentative="1">
+      <w:start w:val="1"/>
+      <w:numFmt w:val="bullet"/>
+      <w:lvlText w:val=""/>
+      <w:lvlJc w:val="left"/>
+      <w:pPr>
+        <w:tabs>
+          <w:tab w:val="num" w:pos="2880"/>
+        </w:tabs>
+        <w:ind w:left="2880" w:hanging="360"/>
+      </w:pPr>
+      <w:rPr>
+        <w:rFonts w:ascii="Wingdings" w:hAnsi="Wingdings" w:hint="default"/>
+        <w:sz w:val="20"/>
+      </w:rPr>
+    </w:lvl>
+    <w:lvl w:ilvl="4" w:tentative="1">
+      <w:start w:val="1"/>
+      <w:numFmt w:val="bullet"/>
+      <w:lvlText w:val=""/>
+      <w:lvlJc w:val="left"/>
+      <w:pPr>
+        <w:tabs>
+          <w:tab w:val="num" w:pos="3600"/>
+        </w:tabs>
+        <w:ind w:left="3600" w:hanging="360"/>
+      </w:pPr>
+      <w:rPr>
+        <w:rFonts w:ascii="Wingdings" w:hAnsi="Wingdings" w:hint="default"/>
+        <w:sz w:val="20"/>
+      </w:rPr>
+    </w:lvl>
+    <w:lvl w:ilvl="5" w:tentative="1">
+      <w:start w:val="1"/>
+      <w:numFmt w:val="bullet"/>
+      <w:lvlText w:val=""/>
+      <w:lvlJc w:val="left"/>
+      <w:pPr>
+        <w:tabs>
+          <w:tab w:val="num" w:pos="4320"/>
+        </w:tabs>
+        <w:ind w:left="4320" w:hanging="360"/>
+      </w:pPr>
+      <w:rPr>
+        <w:rFonts w:ascii="Wingdings" w:hAnsi="Wingdings" w:hint="default"/>
+        <w:sz w:val="20"/>
+      </w:rPr>
+    </w:lvl>
+    <w:lvl w:ilvl="6" w:tentative="1">
+      <w:start w:val="1"/>
+      <w:numFmt w:val="bullet"/>
+      <w:lvlText w:val=""/>
+      <w:lvlJc w:val="left"/>
+      <w:pPr>
+        <w:tabs>
+          <w:tab w:val="num" w:pos="5040"/>
+        </w:tabs>
+        <w:ind w:left="5040" w:hanging="360"/>
+      </w:pPr>
+      <w:rPr>
+        <w:rFonts w:ascii="Wingdings" w:hAnsi="Wingdings" w:hint="default"/>
+        <w:sz w:val="20"/>
+      </w:rPr>
+    </w:lvl>
+    <w:lvl w:ilvl="7" w:tentative="1">
+      <w:start w:val="1"/>
+      <w:numFmt w:val="bullet"/>
+      <w:lvlText w:val=""/>
+      <w:lvlJc w:val="left"/>
+      <w:pPr>
+        <w:tabs>
+          <w:tab w:val="num" w:pos="5760"/>
+        </w:tabs>
+        <w:ind w:left="5760" w:hanging="360"/>
+      </w:pPr>
+      <w:rPr>
+        <w:rFonts w:ascii="Wingdings" w:hAnsi="Wingdings" w:hint="default"/>
+        <w:sz w:val="20"/>
+      </w:rPr>
+    </w:lvl>
+    <w:lvl w:ilvl="8" w:tentative="1">
+      <w:start w:val="1"/>
+      <w:numFmt w:val="bullet"/>
+      <w:lvlText w:val=""/>
+      <w:lvlJc w:val="left"/>
+      <w:pPr>
+        <w:tabs>
+          <w:tab w:val="num" w:pos="6480"/>
+        </w:tabs>
+        <w:ind w:left="6480" w:hanging="360"/>
+      </w:pPr>
+      <w:rPr>
+        <w:rFonts w:ascii="Wingdings" w:hAnsi="Wingdings" w:hint="default"/>
+        <w:sz w:val="20"/>
+      </w:rPr>
+    </w:lvl>
+  </w:abstractNum>
+  <w:abstractNum w:abstractNumId="2" w15:restartNumberingAfterBreak="0">
     <w:nsid w:val="0C850723"/>
     <w:multiLevelType w:val="multilevel"/>
     <w:tmpl w:val="19727A42"/>
@@ -996,7 +1823,156 @@
       </w:rPr>
     </w:lvl>
   </w:abstractNum>
-  <w:abstractNum w:abstractNumId="1" w15:restartNumberingAfterBreak="0">
+  <w:abstractNum w:abstractNumId="3" w15:restartNumberingAfterBreak="0">
+    <w:nsid w:val="180D6E19"/>
+    <w:multiLevelType w:val="multilevel"/>
+    <w:tmpl w:val="1CB47768"/>
+    <w:lvl w:ilvl="0">
+      <w:start w:val="1"/>
+      <w:numFmt w:val="bullet"/>
+      <w:lvlText w:val=""/>
+      <w:lvlJc w:val="left"/>
+      <w:pPr>
+        <w:tabs>
+          <w:tab w:val="num" w:pos="720"/>
+        </w:tabs>
+        <w:ind w:left="720" w:hanging="360"/>
+      </w:pPr>
+      <w:rPr>
+        <w:rFonts w:ascii="Symbol" w:hAnsi="Symbol" w:hint="default"/>
+        <w:sz w:val="20"/>
+      </w:rPr>
+    </w:lvl>
+    <w:lvl w:ilvl="1" w:tentative="1">
+      <w:start w:val="1"/>
+      <w:numFmt w:val="bullet"/>
+      <w:lvlText w:val="o"/>
+      <w:lvlJc w:val="left"/>
+      <w:pPr>
+        <w:tabs>
+          <w:tab w:val="num" w:pos="1440"/>
+        </w:tabs>
+        <w:ind w:left="1440" w:hanging="360"/>
+      </w:pPr>
+      <w:rPr>
+        <w:rFonts w:ascii="Courier New" w:hAnsi="Courier New" w:hint="default"/>
+        <w:sz w:val="20"/>
+      </w:rPr>
+    </w:lvl>
+    <w:lvl w:ilvl="2" w:tentative="1">
+      <w:start w:val="1"/>
+      <w:numFmt w:val="bullet"/>
+      <w:lvlText w:val=""/>
+      <w:lvlJc w:val="left"/>
+      <w:pPr>
+        <w:tabs>
+          <w:tab w:val="num" w:pos="2160"/>
+        </w:tabs>
+        <w:ind w:left="2160" w:hanging="360"/>
+      </w:pPr>
+      <w:rPr>
+        <w:rFonts w:ascii="Wingdings" w:hAnsi="Wingdings" w:hint="default"/>
+        <w:sz w:val="20"/>
+      </w:rPr>
+    </w:lvl>
+    <w:lvl w:ilvl="3" w:tentative="1">
+      <w:start w:val="1"/>
+      <w:numFmt w:val="bullet"/>
+      <w:lvlText w:val=""/>
+      <w:lvlJc w:val="left"/>
+      <w:pPr>
+        <w:tabs>
+          <w:tab w:val="num" w:pos="2880"/>
+        </w:tabs>
+        <w:ind w:left="2880" w:hanging="360"/>
+      </w:pPr>
+      <w:rPr>
+        <w:rFonts w:ascii="Wingdings" w:hAnsi="Wingdings" w:hint="default"/>
+        <w:sz w:val="20"/>
+      </w:rPr>
+    </w:lvl>
+    <w:lvl w:ilvl="4" w:tentative="1">
+      <w:start w:val="1"/>
+      <w:numFmt w:val="bullet"/>
+      <w:lvlText w:val=""/>
+      <w:lvlJc w:val="left"/>
+      <w:pPr>
+        <w:tabs>
+          <w:tab w:val="num" w:pos="3600"/>
+        </w:tabs>
+        <w:ind w:left="3600" w:hanging="360"/>
+      </w:pPr>
+      <w:rPr>
+        <w:rFonts w:ascii="Wingdings" w:hAnsi="Wingdings" w:hint="default"/>
+        <w:sz w:val="20"/>
+      </w:rPr>
+    </w:lvl>
+    <w:lvl w:ilvl="5" w:tentative="1">
+      <w:start w:val="1"/>
+      <w:numFmt w:val="bullet"/>
+      <w:lvlText w:val=""/>
+      <w:lvlJc w:val="left"/>
+      <w:pPr>
+        <w:tabs>
+          <w:tab w:val="num" w:pos="4320"/>
+        </w:tabs>
+        <w:ind w:left="4320" w:hanging="360"/>
+      </w:pPr>
+      <w:rPr>
+        <w:rFonts w:ascii="Wingdings" w:hAnsi="Wingdings" w:hint="default"/>
+        <w:sz w:val="20"/>
+      </w:rPr>
+    </w:lvl>
+    <w:lvl w:ilvl="6" w:tentative="1">
+      <w:start w:val="1"/>
+      <w:numFmt w:val="bullet"/>
+      <w:lvlText w:val=""/>
+      <w:lvlJc w:val="left"/>
+      <w:pPr>
+        <w:tabs>
+          <w:tab w:val="num" w:pos="5040"/>
+        </w:tabs>
+        <w:ind w:left="5040" w:hanging="360"/>
+      </w:pPr>
+      <w:rPr>
+        <w:rFonts w:ascii="Wingdings" w:hAnsi="Wingdings" w:hint="default"/>
+        <w:sz w:val="20"/>
+      </w:rPr>
+    </w:lvl>
+    <w:lvl w:ilvl="7" w:tentative="1">
+      <w:start w:val="1"/>
+      <w:numFmt w:val="bullet"/>
+      <w:lvlText w:val=""/>
+      <w:lvlJc w:val="left"/>
+      <w:pPr>
+        <w:tabs>
+          <w:tab w:val="num" w:pos="5760"/>
+        </w:tabs>
+        <w:ind w:left="5760" w:hanging="360"/>
+      </w:pPr>
+      <w:rPr>
+        <w:rFonts w:ascii="Wingdings" w:hAnsi="Wingdings" w:hint="default"/>
+        <w:sz w:val="20"/>
+      </w:rPr>
+    </w:lvl>
+    <w:lvl w:ilvl="8" w:tentative="1">
+      <w:start w:val="1"/>
+      <w:numFmt w:val="bullet"/>
+      <w:lvlText w:val=""/>
+      <w:lvlJc w:val="left"/>
+      <w:pPr>
+        <w:tabs>
+          <w:tab w:val="num" w:pos="6480"/>
+        </w:tabs>
+        <w:ind w:left="6480" w:hanging="360"/>
+      </w:pPr>
+      <w:rPr>
+        <w:rFonts w:ascii="Wingdings" w:hAnsi="Wingdings" w:hint="default"/>
+        <w:sz w:val="20"/>
+      </w:rPr>
+    </w:lvl>
+  </w:abstractNum>
+  <w:abstractNum w:abstractNumId="4" w15:restartNumberingAfterBreak="0">
     <w:nsid w:val="186C26BE"/>
     <w:multiLevelType w:val="multilevel"/>
     <w:tmpl w:val="1F7898B0"/>
@@ -1145,7 +2121,7 @@
       </w:rPr>
     </w:lvl>
   </w:abstractNum>
-  <w:abstractNum w:abstractNumId="2" w15:restartNumberingAfterBreak="0">
+  <w:abstractNum w:abstractNumId="5" w15:restartNumberingAfterBreak="0">
     <w:nsid w:val="27A80752"/>
     <w:multiLevelType w:val="hybridMultilevel"/>
     <w:tmpl w:val="4470059A"/>
@@ -1257,7 +2233,7 @@
       </w:rPr>
     </w:lvl>
   </w:abstractNum>
-  <w:abstractNum w:abstractNumId="3" w15:restartNumberingAfterBreak="0">
+  <w:abstractNum w:abstractNumId="6" w15:restartNumberingAfterBreak="0">
     <w:nsid w:val="30C10FC1"/>
     <w:multiLevelType w:val="multilevel"/>
     <w:tmpl w:val="0128C614"/>
@@ -1406,7 +2382,7 @@
       </w:rPr>
     </w:lvl>
   </w:abstractNum>
-  <w:abstractNum w:abstractNumId="4" w15:restartNumberingAfterBreak="0">
+  <w:abstractNum w:abstractNumId="7" w15:restartNumberingAfterBreak="0">
     <w:nsid w:val="40983662"/>
     <w:multiLevelType w:val="multilevel"/>
     <w:tmpl w:val="186EAC42"/>
@@ -1555,7 +2531,305 @@
       </w:rPr>
     </w:lvl>
   </w:abstractNum>
-  <w:abstractNum w:abstractNumId="5" w15:restartNumberingAfterBreak="0">
+  <w:abstractNum w:abstractNumId="8" w15:restartNumberingAfterBreak="0">
+    <w:nsid w:val="57A33ECC"/>
+    <w:multiLevelType w:val="multilevel"/>
+    <w:tmpl w:val="CCA20226"/>
+    <w:lvl w:ilvl="0">
+      <w:start w:val="1"/>
+      <w:numFmt w:val="bullet"/>
+      <w:lvlText w:val=""/>
+      <w:lvlJc w:val="left"/>
+      <w:pPr>
+        <w:tabs>
+          <w:tab w:val="num" w:pos="720"/>
+        </w:tabs>
+        <w:ind w:left="720" w:hanging="360"/>
+      </w:pPr>
+      <w:rPr>
+        <w:rFonts w:ascii="Symbol" w:hAnsi="Symbol" w:hint="default"/>
+        <w:sz w:val="20"/>
+      </w:rPr>
+    </w:lvl>
+    <w:lvl w:ilvl="1" w:tentative="1">
+      <w:start w:val="1"/>
+      <w:numFmt w:val="bullet"/>
+      <w:lvlText w:val="o"/>
+      <w:lvlJc w:val="left"/>
+      <w:pPr>
+        <w:tabs>
+          <w:tab w:val="num" w:pos="1440"/>
+        </w:tabs>
+        <w:ind w:left="1440" w:hanging="360"/>
+      </w:pPr>
+      <w:rPr>
+        <w:rFonts w:ascii="Courier New" w:hAnsi="Courier New" w:hint="default"/>
+        <w:sz w:val="20"/>
+      </w:rPr>
+    </w:lvl>
+    <w:lvl w:ilvl="2" w:tentative="1">
+      <w:start w:val="1"/>
+      <w:numFmt w:val="bullet"/>
+      <w:lvlText w:val=""/>
+      <w:lvlJc w:val="left"/>
+      <w:pPr>
+        <w:tabs>
+          <w:tab w:val="num" w:pos="2160"/>
+        </w:tabs>
+        <w:ind w:left="2160" w:hanging="360"/>
+      </w:pPr>
+      <w:rPr>
+        <w:rFonts w:ascii="Wingdings" w:hAnsi="Wingdings" w:hint="default"/>
+        <w:sz w:val="20"/>
+      </w:rPr>
+    </w:lvl>
+    <w:lvl w:ilvl="3" w:tentative="1">
+      <w:start w:val="1"/>
+      <w:numFmt w:val="bullet"/>
+      <w:lvlText w:val=""/>
+      <w:lvlJc w:val="left"/>
+      <w:pPr>
+        <w:tabs>
+          <w:tab w:val="num" w:pos="2880"/>
+        </w:tabs>
+        <w:ind w:left="2880" w:hanging="360"/>
+      </w:pPr>
+      <w:rPr>
+        <w:rFonts w:ascii="Wingdings" w:hAnsi="Wingdings" w:hint="default"/>
+        <w:sz w:val="20"/>
+      </w:rPr>
+    </w:lvl>
+    <w:lvl w:ilvl="4" w:tentative="1">
+      <w:start w:val="1"/>
+      <w:numFmt w:val="bullet"/>
+      <w:lvlText w:val=""/>
+      <w:lvlJc w:val="left"/>
+      <w:pPr>
+        <w:tabs>
+          <w:tab w:val="num" w:pos="3600"/>
+        </w:tabs>
+        <w:ind w:left="3600" w:hanging="360"/>
+      </w:pPr>
+      <w:rPr>
+        <w:rFonts w:ascii="Wingdings" w:hAnsi="Wingdings" w:hint="default"/>
+        <w:sz w:val="20"/>
+      </w:rPr>
+    </w:lvl>
+    <w:lvl w:ilvl="5" w:tentative="1">
+      <w:start w:val="1"/>
+      <w:numFmt w:val="bullet"/>
+      <w:lvlText w:val=""/>
+      <w:lvlJc w:val="left"/>
+      <w:pPr>
+        <w:tabs>
+          <w:tab w:val="num" w:pos="4320"/>
+        </w:tabs>
+        <w:ind w:left="4320" w:hanging="360"/>
+      </w:pPr>
+      <w:rPr>
+        <w:rFonts w:ascii="Wingdings" w:hAnsi="Wingdings" w:hint="default"/>
+        <w:sz w:val="20"/>
+      </w:rPr>
+    </w:lvl>
+    <w:lvl w:ilvl="6" w:tentative="1">
+      <w:start w:val="1"/>
+      <w:numFmt w:val="bullet"/>
+      <w:lvlText w:val=""/>
+      <w:lvlJc w:val="left"/>
+      <w:pPr>
+        <w:tabs>
+          <w:tab w:val="num" w:pos="5040"/>
+        </w:tabs>
+        <w:ind w:left="5040" w:hanging="360"/>
+      </w:pPr>
+      <w:rPr>
+        <w:rFonts w:ascii="Wingdings" w:hAnsi="Wingdings" w:hint="default"/>
+        <w:sz w:val="20"/>
+      </w:rPr>
+    </w:lvl>
+    <w:lvl w:ilvl="7" w:tentative="1">
+      <w:start w:val="1"/>
+      <w:numFmt w:val="bullet"/>
+      <w:lvlText w:val=""/>
+      <w:lvlJc w:val="left"/>
+      <w:pPr>
+        <w:tabs>
+          <w:tab w:val="num" w:pos="5760"/>
+        </w:tabs>
+        <w:ind w:left="5760" w:hanging="360"/>
+      </w:pPr>
+      <w:rPr>
+        <w:rFonts w:ascii="Wingdings" w:hAnsi="Wingdings" w:hint="default"/>
+        <w:sz w:val="20"/>
+      </w:rPr>
+    </w:lvl>
+    <w:lvl w:ilvl="8" w:tentative="1">
+      <w:start w:val="1"/>
+      <w:numFmt w:val="bullet"/>
+      <w:lvlText w:val=""/>
+      <w:lvlJc w:val="left"/>
+      <w:pPr>
+        <w:tabs>
+          <w:tab w:val="num" w:pos="6480"/>
+        </w:tabs>
+        <w:ind w:left="6480" w:hanging="360"/>
+      </w:pPr>
+      <w:rPr>
+        <w:rFonts w:ascii="Wingdings" w:hAnsi="Wingdings" w:hint="default"/>
+        <w:sz w:val="20"/>
+      </w:rPr>
+    </w:lvl>
+  </w:abstractNum>
+  <w:abstractNum w:abstractNumId="9" w15:restartNumberingAfterBreak="0">
+    <w:nsid w:val="5AFC3A23"/>
+    <w:multiLevelType w:val="multilevel"/>
+    <w:tmpl w:val="1072496A"/>
+    <w:lvl w:ilvl="0">
+      <w:start w:val="1"/>
+      <w:numFmt w:val="bullet"/>
+      <w:lvlText w:val=""/>
+      <w:lvlJc w:val="left"/>
+      <w:pPr>
+        <w:tabs>
+          <w:tab w:val="num" w:pos="720"/>
+        </w:tabs>
+        <w:ind w:left="720" w:hanging="360"/>
+      </w:pPr>
+      <w:rPr>
+        <w:rFonts w:ascii="Symbol" w:hAnsi="Symbol" w:hint="default"/>
+        <w:sz w:val="20"/>
+      </w:rPr>
+    </w:lvl>
+    <w:lvl w:ilvl="1" w:tentative="1">
+      <w:start w:val="1"/>
+      <w:numFmt w:val="bullet"/>
+      <w:lvlText w:val="o"/>
+      <w:lvlJc w:val="left"/>
+      <w:pPr>
+        <w:tabs>
+          <w:tab w:val="num" w:pos="1440"/>
+        </w:tabs>
+        <w:ind w:left="1440" w:hanging="360"/>
+      </w:pPr>
+      <w:rPr>
+        <w:rFonts w:ascii="Courier New" w:hAnsi="Courier New" w:hint="default"/>
+        <w:sz w:val="20"/>
+      </w:rPr>
+    </w:lvl>
+    <w:lvl w:ilvl="2" w:tentative="1">
+      <w:start w:val="1"/>
+      <w:numFmt w:val="bullet"/>
+      <w:lvlText w:val=""/>
+      <w:lvlJc w:val="left"/>
+      <w:pPr>
+        <w:tabs>
+          <w:tab w:val="num" w:pos="2160"/>
+        </w:tabs>
+        <w:ind w:left="2160" w:hanging="360"/>
+      </w:pPr>
+      <w:rPr>
+        <w:rFonts w:ascii="Wingdings" w:hAnsi="Wingdings" w:hint="default"/>
+        <w:sz w:val="20"/>
+      </w:rPr>
+    </w:lvl>
+    <w:lvl w:ilvl="3" w:tentative="1">
+      <w:start w:val="1"/>
+      <w:numFmt w:val="bullet"/>
+      <w:lvlText w:val=""/>
+      <w:lvlJc w:val="left"/>
+      <w:pPr>
+        <w:tabs>
+          <w:tab w:val="num" w:pos="2880"/>
+        </w:tabs>
+        <w:ind w:left="2880" w:hanging="360"/>
+      </w:pPr>
+      <w:rPr>
+        <w:rFonts w:ascii="Wingdings" w:hAnsi="Wingdings" w:hint="default"/>
+        <w:sz w:val="20"/>
+      </w:rPr>
+    </w:lvl>
+    <w:lvl w:ilvl="4" w:tentative="1">
+      <w:start w:val="1"/>
+      <w:numFmt w:val="bullet"/>
+      <w:lvlText w:val=""/>
+      <w:lvlJc w:val="left"/>
+      <w:pPr>
+        <w:tabs>
+          <w:tab w:val="num" w:pos="3600"/>
+        </w:tabs>
+        <w:ind w:left="3600" w:hanging="360"/>
+      </w:pPr>
+      <w:rPr>
+        <w:rFonts w:ascii="Wingdings" w:hAnsi="Wingdings" w:hint="default"/>
+        <w:sz w:val="20"/>
+      </w:rPr>
+    </w:lvl>
+    <w:lvl w:ilvl="5" w:tentative="1">
+      <w:start w:val="1"/>
+      <w:numFmt w:val="bullet"/>
+      <w:lvlText w:val=""/>
+      <w:lvlJc w:val="left"/>
+      <w:pPr>
+        <w:tabs>
+          <w:tab w:val="num" w:pos="4320"/>
+        </w:tabs>
+        <w:ind w:left="4320" w:hanging="360"/>
+      </w:pPr>
+      <w:rPr>
+        <w:rFonts w:ascii="Wingdings" w:hAnsi="Wingdings" w:hint="default"/>
+        <w:sz w:val="20"/>
+      </w:rPr>
+    </w:lvl>
+    <w:lvl w:ilvl="6" w:tentative="1">
+      <w:start w:val="1"/>
+      <w:numFmt w:val="bullet"/>
+      <w:lvlText w:val=""/>
+      <w:lvlJc w:val="left"/>
+      <w:pPr>
+        <w:tabs>
+          <w:tab w:val="num" w:pos="5040"/>
+        </w:tabs>
+        <w:ind w:left="5040" w:hanging="360"/>
+      </w:pPr>
+      <w:rPr>
+        <w:rFonts w:ascii="Wingdings" w:hAnsi="Wingdings" w:hint="default"/>
+        <w:sz w:val="20"/>
+      </w:rPr>
+    </w:lvl>
+    <w:lvl w:ilvl="7" w:tentative="1">
+      <w:start w:val="1"/>
+      <w:numFmt w:val="bullet"/>
+      <w:lvlText w:val=""/>
+      <w:lvlJc w:val="left"/>
+      <w:pPr>
+        <w:tabs>
+          <w:tab w:val="num" w:pos="5760"/>
+        </w:tabs>
+        <w:ind w:left="5760" w:hanging="360"/>
+      </w:pPr>
+      <w:rPr>
+        <w:rFonts w:ascii="Wingdings" w:hAnsi="Wingdings" w:hint="default"/>
+        <w:sz w:val="20"/>
+      </w:rPr>
+    </w:lvl>
+    <w:lvl w:ilvl="8" w:tentative="1">
+      <w:start w:val="1"/>
+      <w:numFmt w:val="bullet"/>
+      <w:lvlText w:val=""/>
+      <w:lvlJc w:val="left"/>
+      <w:pPr>
+        <w:tabs>
+          <w:tab w:val="num" w:pos="6480"/>
+        </w:tabs>
+        <w:ind w:left="6480" w:hanging="360"/>
+      </w:pPr>
+      <w:rPr>
+        <w:rFonts w:ascii="Wingdings" w:hAnsi="Wingdings" w:hint="default"/>
+        <w:sz w:val="20"/>
+      </w:rPr>
+    </w:lvl>
+  </w:abstractNum>
+  <w:abstractNum w:abstractNumId="10" w15:restartNumberingAfterBreak="0">
     <w:nsid w:val="5B1F029C"/>
     <w:multiLevelType w:val="multilevel"/>
     <w:tmpl w:val="8D14A4E4"/>
@@ -1704,7 +2978,7 @@
       </w:rPr>
     </w:lvl>
   </w:abstractNum>
-  <w:abstractNum w:abstractNumId="6" w15:restartNumberingAfterBreak="0">
+  <w:abstractNum w:abstractNumId="11" w15:restartNumberingAfterBreak="0">
     <w:nsid w:val="61D14DF9"/>
     <w:multiLevelType w:val="multilevel"/>
     <w:tmpl w:val="0420C162"/>
@@ -1853,7 +3127,156 @@
       </w:rPr>
     </w:lvl>
   </w:abstractNum>
-  <w:abstractNum w:abstractNumId="7" w15:restartNumberingAfterBreak="0">
+  <w:abstractNum w:abstractNumId="12" w15:restartNumberingAfterBreak="0">
+    <w:nsid w:val="62D84D06"/>
+    <w:multiLevelType w:val="multilevel"/>
+    <w:tmpl w:val="67523016"/>
+    <w:lvl w:ilvl="0">
+      <w:start w:val="1"/>
+      <w:numFmt w:val="bullet"/>
+      <w:lvlText w:val=""/>
+      <w:lvlJc w:val="left"/>
+      <w:pPr>
+        <w:tabs>
+          <w:tab w:val="num" w:pos="720"/>
+        </w:tabs>
+        <w:ind w:left="720" w:hanging="360"/>
+      </w:pPr>
+      <w:rPr>
+        <w:rFonts w:ascii="Symbol" w:hAnsi="Symbol" w:hint="default"/>
+        <w:sz w:val="20"/>
+      </w:rPr>
+    </w:lvl>
+    <w:lvl w:ilvl="1" w:tentative="1">
+      <w:start w:val="1"/>
+      <w:numFmt w:val="bullet"/>
+      <w:lvlText w:val="o"/>
+      <w:lvlJc w:val="left"/>
+      <w:pPr>
+        <w:tabs>
+          <w:tab w:val="num" w:pos="1440"/>
+        </w:tabs>
+        <w:ind w:left="1440" w:hanging="360"/>
+      </w:pPr>
+      <w:rPr>
+        <w:rFonts w:ascii="Courier New" w:hAnsi="Courier New" w:hint="default"/>
+        <w:sz w:val="20"/>
+      </w:rPr>
+    </w:lvl>
+    <w:lvl w:ilvl="2" w:tentative="1">
+      <w:start w:val="1"/>
+      <w:numFmt w:val="bullet"/>
+      <w:lvlText w:val=""/>
+      <w:lvlJc w:val="left"/>
+      <w:pPr>
+        <w:tabs>
+          <w:tab w:val="num" w:pos="2160"/>
+        </w:tabs>
+        <w:ind w:left="2160" w:hanging="360"/>
+      </w:pPr>
+      <w:rPr>
+        <w:rFonts w:ascii="Wingdings" w:hAnsi="Wingdings" w:hint="default"/>
+        <w:sz w:val="20"/>
+      </w:rPr>
+    </w:lvl>
+    <w:lvl w:ilvl="3" w:tentative="1">
+      <w:start w:val="1"/>
+      <w:numFmt w:val="bullet"/>
+      <w:lvlText w:val=""/>
+      <w:lvlJc w:val="left"/>
+      <w:pPr>
+        <w:tabs>
+          <w:tab w:val="num" w:pos="2880"/>
+        </w:tabs>
+        <w:ind w:left="2880" w:hanging="360"/>
+      </w:pPr>
+      <w:rPr>
+        <w:rFonts w:ascii="Wingdings" w:hAnsi="Wingdings" w:hint="default"/>
+        <w:sz w:val="20"/>
+      </w:rPr>
+    </w:lvl>
+    <w:lvl w:ilvl="4" w:tentative="1">
+      <w:start w:val="1"/>
+      <w:numFmt w:val="bullet"/>
+      <w:lvlText w:val=""/>
+      <w:lvlJc w:val="left"/>
+      <w:pPr>
+        <w:tabs>
+          <w:tab w:val="num" w:pos="3600"/>
+        </w:tabs>
+        <w:ind w:left="3600" w:hanging="360"/>
+      </w:pPr>
+      <w:rPr>
+        <w:rFonts w:ascii="Wingdings" w:hAnsi="Wingdings" w:hint="default"/>
+        <w:sz w:val="20"/>
+      </w:rPr>
+    </w:lvl>
+    <w:lvl w:ilvl="5" w:tentative="1">
+      <w:start w:val="1"/>
+      <w:numFmt w:val="bullet"/>
+      <w:lvlText w:val=""/>
+      <w:lvlJc w:val="left"/>
+      <w:pPr>
+        <w:tabs>
+          <w:tab w:val="num" w:pos="4320"/>
+        </w:tabs>
+        <w:ind w:left="4320" w:hanging="360"/>
+      </w:pPr>
+      <w:rPr>
+        <w:rFonts w:ascii="Wingdings" w:hAnsi="Wingdings" w:hint="default"/>
+        <w:sz w:val="20"/>
+      </w:rPr>
+    </w:lvl>
+    <w:lvl w:ilvl="6" w:tentative="1">
+      <w:start w:val="1"/>
+      <w:numFmt w:val="bullet"/>
+      <w:lvlText w:val=""/>
+      <w:lvlJc w:val="left"/>
+      <w:pPr>
+        <w:tabs>
+          <w:tab w:val="num" w:pos="5040"/>
+        </w:tabs>
+        <w:ind w:left="5040" w:hanging="360"/>
+      </w:pPr>
+      <w:rPr>
+        <w:rFonts w:ascii="Wingdings" w:hAnsi="Wingdings" w:hint="default"/>
+        <w:sz w:val="20"/>
+      </w:rPr>
+    </w:lvl>
+    <w:lvl w:ilvl="7" w:tentative="1">
+      <w:start w:val="1"/>
+      <w:numFmt w:val="bullet"/>
+      <w:lvlText w:val=""/>
+      <w:lvlJc w:val="left"/>
+      <w:pPr>
+        <w:tabs>
+          <w:tab w:val="num" w:pos="5760"/>
+        </w:tabs>
+        <w:ind w:left="5760" w:hanging="360"/>
+      </w:pPr>
+      <w:rPr>
+        <w:rFonts w:ascii="Wingdings" w:hAnsi="Wingdings" w:hint="default"/>
+        <w:sz w:val="20"/>
+      </w:rPr>
+    </w:lvl>
+    <w:lvl w:ilvl="8" w:tentative="1">
+      <w:start w:val="1"/>
+      <w:numFmt w:val="bullet"/>
+      <w:lvlText w:val=""/>
+      <w:lvlJc w:val="left"/>
+      <w:pPr>
+        <w:tabs>
+          <w:tab w:val="num" w:pos="6480"/>
+        </w:tabs>
+        <w:ind w:left="6480" w:hanging="360"/>
+      </w:pPr>
+      <w:rPr>
+        <w:rFonts w:ascii="Wingdings" w:hAnsi="Wingdings" w:hint="default"/>
+        <w:sz w:val="20"/>
+      </w:rPr>
+    </w:lvl>
+  </w:abstractNum>
+  <w:abstractNum w:abstractNumId="13" w15:restartNumberingAfterBreak="0">
     <w:nsid w:val="6A7C5C72"/>
     <w:multiLevelType w:val="multilevel"/>
     <w:tmpl w:val="AF304272"/>
@@ -2002,7 +3425,7 @@
       </w:rPr>
     </w:lvl>
   </w:abstractNum>
-  <w:abstractNum w:abstractNumId="8" w15:restartNumberingAfterBreak="0">
+  <w:abstractNum w:abstractNumId="14" w15:restartNumberingAfterBreak="0">
     <w:nsid w:val="6E3D6F7F"/>
     <w:multiLevelType w:val="multilevel"/>
     <w:tmpl w:val="41247BB2"/>
@@ -2151,32 +3574,354 @@
       </w:rPr>
     </w:lvl>
   </w:abstractNum>
+  <w:abstractNum w:abstractNumId="15" w15:restartNumberingAfterBreak="0">
+    <w:nsid w:val="743D2B6B"/>
+    <w:multiLevelType w:val="multilevel"/>
+    <w:tmpl w:val="B9D490C4"/>
+    <w:lvl w:ilvl="0">
+      <w:start w:val="1"/>
+      <w:numFmt w:val="bullet"/>
+      <w:lvlText w:val=""/>
+      <w:lvlJc w:val="left"/>
+      <w:pPr>
+        <w:tabs>
+          <w:tab w:val="num" w:pos="720"/>
+        </w:tabs>
+        <w:ind w:left="720" w:hanging="360"/>
+      </w:pPr>
+      <w:rPr>
+        <w:rFonts w:ascii="Symbol" w:hAnsi="Symbol" w:hint="default"/>
+        <w:sz w:val="20"/>
+      </w:rPr>
+    </w:lvl>
+    <w:lvl w:ilvl="1" w:tentative="1">
+      <w:start w:val="1"/>
+      <w:numFmt w:val="bullet"/>
+      <w:lvlText w:val="o"/>
+      <w:lvlJc w:val="left"/>
+      <w:pPr>
+        <w:tabs>
+          <w:tab w:val="num" w:pos="1440"/>
+        </w:tabs>
+        <w:ind w:left="1440" w:hanging="360"/>
+      </w:pPr>
+      <w:rPr>
+        <w:rFonts w:ascii="Courier New" w:hAnsi="Courier New" w:hint="default"/>
+        <w:sz w:val="20"/>
+      </w:rPr>
+    </w:lvl>
+    <w:lvl w:ilvl="2" w:tentative="1">
+      <w:start w:val="1"/>
+      <w:numFmt w:val="bullet"/>
+      <w:lvlText w:val=""/>
+      <w:lvlJc w:val="left"/>
+      <w:pPr>
+        <w:tabs>
+          <w:tab w:val="num" w:pos="2160"/>
+        </w:tabs>
+        <w:ind w:left="2160" w:hanging="360"/>
+      </w:pPr>
+      <w:rPr>
+        <w:rFonts w:ascii="Wingdings" w:hAnsi="Wingdings" w:hint="default"/>
+        <w:sz w:val="20"/>
+      </w:rPr>
+    </w:lvl>
+    <w:lvl w:ilvl="3" w:tentative="1">
+      <w:start w:val="1"/>
+      <w:numFmt w:val="bullet"/>
+      <w:lvlText w:val=""/>
+      <w:lvlJc w:val="left"/>
+      <w:pPr>
+        <w:tabs>
+          <w:tab w:val="num" w:pos="2880"/>
+        </w:tabs>
+        <w:ind w:left="2880" w:hanging="360"/>
+      </w:pPr>
+      <w:rPr>
+        <w:rFonts w:ascii="Wingdings" w:hAnsi="Wingdings" w:hint="default"/>
+        <w:sz w:val="20"/>
+      </w:rPr>
+    </w:lvl>
+    <w:lvl w:ilvl="4" w:tentative="1">
+      <w:start w:val="1"/>
+      <w:numFmt w:val="bullet"/>
+      <w:lvlText w:val=""/>
+      <w:lvlJc w:val="left"/>
+      <w:pPr>
+        <w:tabs>
+          <w:tab w:val="num" w:pos="3600"/>
+        </w:tabs>
+        <w:ind w:left="3600" w:hanging="360"/>
+      </w:pPr>
+      <w:rPr>
+        <w:rFonts w:ascii="Wingdings" w:hAnsi="Wingdings" w:hint="default"/>
+        <w:sz w:val="20"/>
+      </w:rPr>
+    </w:lvl>
+    <w:lvl w:ilvl="5" w:tentative="1">
+      <w:start w:val="1"/>
+      <w:numFmt w:val="bullet"/>
+      <w:lvlText w:val=""/>
+      <w:lvlJc w:val="left"/>
+      <w:pPr>
+        <w:tabs>
+          <w:tab w:val="num" w:pos="4320"/>
+        </w:tabs>
+        <w:ind w:left="4320" w:hanging="360"/>
+      </w:pPr>
+      <w:rPr>
+        <w:rFonts w:ascii="Wingdings" w:hAnsi="Wingdings" w:hint="default"/>
+        <w:sz w:val="20"/>
+      </w:rPr>
+    </w:lvl>
+    <w:lvl w:ilvl="6" w:tentative="1">
+      <w:start w:val="1"/>
+      <w:numFmt w:val="bullet"/>
+      <w:lvlText w:val=""/>
+      <w:lvlJc w:val="left"/>
+      <w:pPr>
+        <w:tabs>
+          <w:tab w:val="num" w:pos="5040"/>
+        </w:tabs>
+        <w:ind w:left="5040" w:hanging="360"/>
+      </w:pPr>
+      <w:rPr>
+        <w:rFonts w:ascii="Wingdings" w:hAnsi="Wingdings" w:hint="default"/>
+        <w:sz w:val="20"/>
+      </w:rPr>
+    </w:lvl>
+    <w:lvl w:ilvl="7" w:tentative="1">
+      <w:start w:val="1"/>
+      <w:numFmt w:val="bullet"/>
+      <w:lvlText w:val=""/>
+      <w:lvlJc w:val="left"/>
+      <w:pPr>
+        <w:tabs>
+          <w:tab w:val="num" w:pos="5760"/>
+        </w:tabs>
+        <w:ind w:left="5760" w:hanging="360"/>
+      </w:pPr>
+      <w:rPr>
+        <w:rFonts w:ascii="Wingdings" w:hAnsi="Wingdings" w:hint="default"/>
+        <w:sz w:val="20"/>
+      </w:rPr>
+    </w:lvl>
+    <w:lvl w:ilvl="8" w:tentative="1">
+      <w:start w:val="1"/>
+      <w:numFmt w:val="bullet"/>
+      <w:lvlText w:val=""/>
+      <w:lvlJc w:val="left"/>
+      <w:pPr>
+        <w:tabs>
+          <w:tab w:val="num" w:pos="6480"/>
+        </w:tabs>
+        <w:ind w:left="6480" w:hanging="360"/>
+      </w:pPr>
+      <w:rPr>
+        <w:rFonts w:ascii="Wingdings" w:hAnsi="Wingdings" w:hint="default"/>
+        <w:sz w:val="20"/>
+      </w:rPr>
+    </w:lvl>
+  </w:abstractNum>
+  <w:abstractNum w:abstractNumId="16" w15:restartNumberingAfterBreak="0">
+    <w:nsid w:val="74C03443"/>
+    <w:multiLevelType w:val="multilevel"/>
+    <w:tmpl w:val="6AE8B8CC"/>
+    <w:lvl w:ilvl="0">
+      <w:start w:val="1"/>
+      <w:numFmt w:val="bullet"/>
+      <w:lvlText w:val=""/>
+      <w:lvlJc w:val="left"/>
+      <w:pPr>
+        <w:tabs>
+          <w:tab w:val="num" w:pos="720"/>
+        </w:tabs>
+        <w:ind w:left="720" w:hanging="360"/>
+      </w:pPr>
+      <w:rPr>
+        <w:rFonts w:ascii="Symbol" w:hAnsi="Symbol" w:hint="default"/>
+        <w:sz w:val="20"/>
+      </w:rPr>
+    </w:lvl>
+    <w:lvl w:ilvl="1" w:tentative="1">
+      <w:start w:val="1"/>
+      <w:numFmt w:val="bullet"/>
+      <w:lvlText w:val="o"/>
+      <w:lvlJc w:val="left"/>
+      <w:pPr>
+        <w:tabs>
+          <w:tab w:val="num" w:pos="1440"/>
+        </w:tabs>
+        <w:ind w:left="1440" w:hanging="360"/>
+      </w:pPr>
+      <w:rPr>
+        <w:rFonts w:ascii="Courier New" w:hAnsi="Courier New" w:hint="default"/>
+        <w:sz w:val="20"/>
+      </w:rPr>
+    </w:lvl>
+    <w:lvl w:ilvl="2" w:tentative="1">
+      <w:start w:val="1"/>
+      <w:numFmt w:val="bullet"/>
+      <w:lvlText w:val=""/>
+      <w:lvlJc w:val="left"/>
+      <w:pPr>
+        <w:tabs>
+          <w:tab w:val="num" w:pos="2160"/>
+        </w:tabs>
+        <w:ind w:left="2160" w:hanging="360"/>
+      </w:pPr>
+      <w:rPr>
+        <w:rFonts w:ascii="Wingdings" w:hAnsi="Wingdings" w:hint="default"/>
+        <w:sz w:val="20"/>
+      </w:rPr>
+    </w:lvl>
+    <w:lvl w:ilvl="3" w:tentative="1">
+      <w:start w:val="1"/>
+      <w:numFmt w:val="bullet"/>
+      <w:lvlText w:val=""/>
+      <w:lvlJc w:val="left"/>
+      <w:pPr>
+        <w:tabs>
+          <w:tab w:val="num" w:pos="2880"/>
+        </w:tabs>
+        <w:ind w:left="2880" w:hanging="360"/>
+      </w:pPr>
+      <w:rPr>
+        <w:rFonts w:ascii="Wingdings" w:hAnsi="Wingdings" w:hint="default"/>
+        <w:sz w:val="20"/>
+      </w:rPr>
+    </w:lvl>
+    <w:lvl w:ilvl="4" w:tentative="1">
+      <w:start w:val="1"/>
+      <w:numFmt w:val="bullet"/>
+      <w:lvlText w:val=""/>
+      <w:lvlJc w:val="left"/>
+      <w:pPr>
+        <w:tabs>
+          <w:tab w:val="num" w:pos="3600"/>
+        </w:tabs>
+        <w:ind w:left="3600" w:hanging="360"/>
+      </w:pPr>
+      <w:rPr>
+        <w:rFonts w:ascii="Wingdings" w:hAnsi="Wingdings" w:hint="default"/>
+        <w:sz w:val="20"/>
+      </w:rPr>
+    </w:lvl>
+    <w:lvl w:ilvl="5" w:tentative="1">
+      <w:start w:val="1"/>
+      <w:numFmt w:val="bullet"/>
+      <w:lvlText w:val=""/>
+      <w:lvlJc w:val="left"/>
+      <w:pPr>
+        <w:tabs>
+          <w:tab w:val="num" w:pos="4320"/>
+        </w:tabs>
+        <w:ind w:left="4320" w:hanging="360"/>
+      </w:pPr>
+      <w:rPr>
+        <w:rFonts w:ascii="Wingdings" w:hAnsi="Wingdings" w:hint="default"/>
+        <w:sz w:val="20"/>
+      </w:rPr>
+    </w:lvl>
+    <w:lvl w:ilvl="6" w:tentative="1">
+      <w:start w:val="1"/>
+      <w:numFmt w:val="bullet"/>
+      <w:lvlText w:val=""/>
+      <w:lvlJc w:val="left"/>
+      <w:pPr>
+        <w:tabs>
+          <w:tab w:val="num" w:pos="5040"/>
+        </w:tabs>
+        <w:ind w:left="5040" w:hanging="360"/>
+      </w:pPr>
+      <w:rPr>
+        <w:rFonts w:ascii="Wingdings" w:hAnsi="Wingdings" w:hint="default"/>
+        <w:sz w:val="20"/>
+      </w:rPr>
+    </w:lvl>
+    <w:lvl w:ilvl="7" w:tentative="1">
+      <w:start w:val="1"/>
+      <w:numFmt w:val="bullet"/>
+      <w:lvlText w:val=""/>
+      <w:lvlJc w:val="left"/>
+      <w:pPr>
+        <w:tabs>
+          <w:tab w:val="num" w:pos="5760"/>
+        </w:tabs>
+        <w:ind w:left="5760" w:hanging="360"/>
+      </w:pPr>
+      <w:rPr>
+        <w:rFonts w:ascii="Wingdings" w:hAnsi="Wingdings" w:hint="default"/>
+        <w:sz w:val="20"/>
+      </w:rPr>
+    </w:lvl>
+    <w:lvl w:ilvl="8" w:tentative="1">
+      <w:start w:val="1"/>
+      <w:numFmt w:val="bullet"/>
+      <w:lvlText w:val=""/>
+      <w:lvlJc w:val="left"/>
+      <w:pPr>
+        <w:tabs>
+          <w:tab w:val="num" w:pos="6480"/>
+        </w:tabs>
+        <w:ind w:left="6480" w:hanging="360"/>
+      </w:pPr>
+      <w:rPr>
+        <w:rFonts w:ascii="Wingdings" w:hAnsi="Wingdings" w:hint="default"/>
+        <w:sz w:val="20"/>
+      </w:rPr>
+    </w:lvl>
+  </w:abstractNum>
   <w:num w:numId="1" w16cid:durableId="1037240408">
+    <w:abstractNumId w:val="5"/>
+  </w:num>
+  <w:num w:numId="2" w16cid:durableId="927039420">
+    <w:abstractNumId w:val="11"/>
+  </w:num>
+  <w:num w:numId="3" w16cid:durableId="1245065221">
+    <w:abstractNumId w:val="6"/>
+  </w:num>
+  <w:num w:numId="4" w16cid:durableId="374626781">
+    <w:abstractNumId w:val="10"/>
+  </w:num>
+  <w:num w:numId="5" w16cid:durableId="2087341555">
+    <w:abstractNumId w:val="7"/>
+  </w:num>
+  <w:num w:numId="6" w16cid:durableId="1052382585">
+    <w:abstractNumId w:val="13"/>
+  </w:num>
+  <w:num w:numId="7" w16cid:durableId="2056193097">
+    <w:abstractNumId w:val="14"/>
+  </w:num>
+  <w:num w:numId="8" w16cid:durableId="477921141">
+    <w:abstractNumId w:val="4"/>
+  </w:num>
+  <w:num w:numId="9" w16cid:durableId="1680540297">
     <w:abstractNumId w:val="2"/>
   </w:num>
-  <w:num w:numId="2" w16cid:durableId="927039420">
-    <w:abstractNumId w:val="6"/>
+  <w:num w:numId="10" w16cid:durableId="107361161">
+    <w:abstractNumId w:val="12"/>
   </w:num>
-  <w:num w:numId="3" w16cid:durableId="1245065221">
+  <w:num w:numId="11" w16cid:durableId="1855876307">
+    <w:abstractNumId w:val="9"/>
+  </w:num>
+  <w:num w:numId="12" w16cid:durableId="673648032">
     <w:abstractNumId w:val="3"/>
   </w:num>
-  <w:num w:numId="4" w16cid:durableId="374626781">
-    <w:abstractNumId w:val="5"/>
+  <w:num w:numId="13" w16cid:durableId="178861593">
+    <w:abstractNumId w:val="16"/>
   </w:num>
-  <w:num w:numId="5" w16cid:durableId="2087341555">
-    <w:abstractNumId w:val="4"/>
+  <w:num w:numId="14" w16cid:durableId="1589386036">
+    <w:abstractNumId w:val="0"/>
   </w:num>
-  <w:num w:numId="6" w16cid:durableId="1052382585">
-    <w:abstractNumId w:val="7"/>
-  </w:num>
-  <w:num w:numId="7" w16cid:durableId="2056193097">
+  <w:num w:numId="15" w16cid:durableId="1751778574">
     <w:abstractNumId w:val="8"/>
   </w:num>
-  <w:num w:numId="8" w16cid:durableId="477921141">
+  <w:num w:numId="16" w16cid:durableId="1072235322">
     <w:abstractNumId w:val="1"/>
   </w:num>
-  <w:num w:numId="9" w16cid:durableId="1680540297">
-    <w:abstractNumId w:val="0"/>
+  <w:num w:numId="17" w16cid:durableId="204565904">
+    <w:abstractNumId w:val="15"/>
   </w:num>
 </w:numbering>
 </file>

</xml_diff>